<commit_message>
first final version of fqw text
</commit_message>
<xml_diff>
--- a/speech.docx
+++ b/speech.docx
@@ -16,41 +16,7 @@
           <w:sz w:val="24"/>
           <w:szCs w:val="24"/>
         </w:rPr>
-        <w:t xml:space="preserve">Меня зовут </w:t>
-      </w:r>
-      <w:proofErr w:type="spellStart"/>
-      <w:r>
-        <w:rPr>
-          <w:rFonts w:cstheme="minorHAnsi"/>
-          <w:sz w:val="24"/>
-          <w:szCs w:val="24"/>
-        </w:rPr>
-        <w:t>Плугин</w:t>
-      </w:r>
-      <w:proofErr w:type="spellEnd"/>
-      <w:r>
-        <w:rPr>
-          <w:rFonts w:cstheme="minorHAnsi"/>
-          <w:sz w:val="24"/>
-          <w:szCs w:val="24"/>
-        </w:rPr>
-        <w:t xml:space="preserve"> Олег, и я представляю свою выпускную квалификационную работу по теме «</w:t>
-      </w:r>
-      <w:r>
-        <w:rPr>
-          <w:rFonts w:cstheme="minorHAnsi"/>
-          <w:sz w:val="24"/>
-          <w:szCs w:val="24"/>
-        </w:rPr>
-        <w:t>Разработка модели распознавания автомобильных номеров на основе технологий компьютерного зрения</w:t>
-      </w:r>
-      <w:r>
-        <w:rPr>
-          <w:rFonts w:cstheme="minorHAnsi"/>
-          <w:sz w:val="24"/>
-          <w:szCs w:val="24"/>
-        </w:rPr>
-        <w:t>».</w:t>
+        <w:t>Меня зовут Плугин Олег, и я представляю свою выпускную квалификационную работу по теме «Разработка модели распознавания автомобильных номеров на основе технологий компьютерного зрения».</w:t>
       </w:r>
     </w:p>
     <w:p>
@@ -77,55 +43,7 @@
           <w:sz w:val="24"/>
           <w:szCs w:val="24"/>
         </w:rPr>
-        <w:t xml:space="preserve"> моей работы стало создание прототипа приложения, которое способно в</w:t>
-      </w:r>
-      <w:r>
-        <w:rPr>
-          <w:rFonts w:cstheme="minorHAnsi"/>
-          <w:sz w:val="24"/>
-          <w:szCs w:val="24"/>
-        </w:rPr>
-        <w:t xml:space="preserve"> режиме реального времени обнаруживать </w:t>
-      </w:r>
-      <w:r>
-        <w:rPr>
-          <w:rFonts w:cstheme="minorHAnsi"/>
-          <w:sz w:val="24"/>
-          <w:szCs w:val="24"/>
-        </w:rPr>
-        <w:t xml:space="preserve">и </w:t>
-      </w:r>
-      <w:r>
-        <w:rPr>
-          <w:rFonts w:cstheme="minorHAnsi"/>
-          <w:sz w:val="24"/>
-          <w:szCs w:val="24"/>
-        </w:rPr>
-        <w:t xml:space="preserve">распознавать </w:t>
-      </w:r>
-      <w:r>
-        <w:rPr>
-          <w:rFonts w:cstheme="minorHAnsi"/>
-          <w:sz w:val="24"/>
-          <w:szCs w:val="24"/>
-        </w:rPr>
-        <w:t xml:space="preserve">автомобильные </w:t>
-      </w:r>
-      <w:r>
-        <w:rPr>
-          <w:rFonts w:cstheme="minorHAnsi"/>
-          <w:sz w:val="24"/>
-          <w:szCs w:val="24"/>
-        </w:rPr>
-        <w:t>номера на основе современных методов компьютерного зрения</w:t>
-      </w:r>
-      <w:r>
-        <w:rPr>
-          <w:rFonts w:cstheme="minorHAnsi"/>
-          <w:sz w:val="24"/>
-          <w:szCs w:val="24"/>
-        </w:rPr>
-        <w:t>.</w:t>
+        <w:t xml:space="preserve"> моей работы стало создание прототипа приложения, которое способно в режиме реального времени обнаруживать и распознавать автомобильные номера на основе современных методов компьютерного зрения.</w:t>
       </w:r>
     </w:p>
     <w:p>
@@ -311,7 +229,23 @@
           <w:sz w:val="24"/>
           <w:szCs w:val="24"/>
         </w:rPr>
-        <w:t>Существующие промышленные решения либо стоят дорого, либо требуют специального оборудования и настройки. Поэтому была поставлена задача разработать более доступное и гибкое решение, которое можно адаптировать под конкретные условия.</w:t>
+        <w:t xml:space="preserve">Существующие промышленные решения либо стоят дорого, либо требуют специального оборудования и настройки. Поэтому </w:t>
+      </w:r>
+      <w:r>
+        <w:rPr>
+          <w:rFonts w:cstheme="minorHAnsi"/>
+          <w:sz w:val="24"/>
+          <w:szCs w:val="24"/>
+        </w:rPr>
+        <w:t>возникла необходимость</w:t>
+      </w:r>
+      <w:r>
+        <w:rPr>
+          <w:rFonts w:cstheme="minorHAnsi"/>
+          <w:sz w:val="24"/>
+          <w:szCs w:val="24"/>
+        </w:rPr>
+        <w:t xml:space="preserve"> разработать более доступное и гибкое решение, которое можно адаптировать под конкретные условия.</w:t>
       </w:r>
     </w:p>
     <w:p>
@@ -339,35 +273,7 @@
         <w:rPr>
           <w:rFonts w:asciiTheme="minorHAnsi" w:hAnsiTheme="minorHAnsi" w:cstheme="minorHAnsi"/>
         </w:rPr>
-        <w:t xml:space="preserve"> были изучены как российские системы, например, ПОТОК и </w:t>
-      </w:r>
-      <w:proofErr w:type="spellStart"/>
-      <w:r>
-        <w:rPr>
-          <w:rFonts w:asciiTheme="minorHAnsi" w:hAnsiTheme="minorHAnsi" w:cstheme="minorHAnsi"/>
-        </w:rPr>
-        <w:t>AutoTRASSIR</w:t>
-      </w:r>
-      <w:proofErr w:type="spellEnd"/>
-      <w:r>
-        <w:rPr>
-          <w:rFonts w:asciiTheme="minorHAnsi" w:hAnsiTheme="minorHAnsi" w:cstheme="minorHAnsi"/>
-        </w:rPr>
-        <w:t xml:space="preserve">, так и зарубежные — такие как </w:t>
-      </w:r>
-      <w:proofErr w:type="spellStart"/>
-      <w:r>
-        <w:rPr>
-          <w:rFonts w:asciiTheme="minorHAnsi" w:hAnsiTheme="minorHAnsi" w:cstheme="minorHAnsi"/>
-        </w:rPr>
-        <w:t>OpenALPR</w:t>
-      </w:r>
-      <w:proofErr w:type="spellEnd"/>
-      <w:r>
-        <w:rPr>
-          <w:rFonts w:asciiTheme="minorHAnsi" w:hAnsiTheme="minorHAnsi" w:cstheme="minorHAnsi"/>
-        </w:rPr>
-        <w:t xml:space="preserve"> и </w:t>
+        <w:t xml:space="preserve"> были изучены как российские системы, например, ПОТОК и AutoTRASSIR, так и зарубежные — такие как OpenALPR и </w:t>
       </w:r>
       <w:r>
         <w:rPr>
@@ -380,19 +286,7 @@
         <w:rPr>
           <w:rFonts w:asciiTheme="minorHAnsi" w:hAnsiTheme="minorHAnsi" w:cstheme="minorHAnsi"/>
         </w:rPr>
-        <w:t xml:space="preserve">. Для </w:t>
-      </w:r>
-      <w:r>
-        <w:rPr>
-          <w:rFonts w:asciiTheme="minorHAnsi" w:hAnsiTheme="minorHAnsi" w:cstheme="minorHAnsi"/>
-        </w:rPr>
-        <w:t>исследования</w:t>
-      </w:r>
-      <w:r>
-        <w:rPr>
-          <w:rFonts w:asciiTheme="minorHAnsi" w:hAnsiTheme="minorHAnsi" w:cstheme="minorHAnsi"/>
-        </w:rPr>
-        <w:t xml:space="preserve"> использовались критерии: точность, стоимость внедрения и используемые технологии.</w:t>
+        <w:t>. Для исследования использовались критерии: точность, стоимость внедрения и используемые технологии.</w:t>
       </w:r>
     </w:p>
     <w:p>
@@ -407,26 +301,6 @@
           <w:rFonts w:asciiTheme="minorHAnsi" w:hAnsiTheme="minorHAnsi" w:cstheme="minorHAnsi"/>
         </w:rPr>
         <w:t>На слайде представлены примеры пользовательских интерфейсов рассмотренных решений.</w:t>
-      </w:r>
-      <w:r>
-        <w:rPr>
-          <w:rFonts w:asciiTheme="minorHAnsi" w:hAnsiTheme="minorHAnsi" w:cstheme="minorHAnsi"/>
-        </w:rPr>
-        <w:t xml:space="preserve"> Некоторые из них выглядят слегка </w:t>
-      </w:r>
-      <w:proofErr w:type="spellStart"/>
-      <w:r>
-        <w:rPr>
-          <w:rFonts w:asciiTheme="minorHAnsi" w:hAnsiTheme="minorHAnsi" w:cstheme="minorHAnsi"/>
-        </w:rPr>
-        <w:t>устаревше</w:t>
-      </w:r>
-      <w:proofErr w:type="spellEnd"/>
-      <w:r>
-        <w:rPr>
-          <w:rFonts w:asciiTheme="minorHAnsi" w:hAnsiTheme="minorHAnsi" w:cstheme="minorHAnsi"/>
-        </w:rPr>
-        <w:t>.</w:t>
       </w:r>
     </w:p>
     <w:p>
@@ -448,47 +322,7 @@
           <w:b/>
           <w:bCs/>
         </w:rPr>
-        <w:t>требования к разрабатываемой системе</w:t>
-      </w:r>
-      <w:r>
-        <w:rPr>
-          <w:rFonts w:asciiTheme="minorHAnsi" w:hAnsiTheme="minorHAnsi" w:cstheme="minorHAnsi"/>
-        </w:rPr>
-        <w:t xml:space="preserve">: высокая точность, работа в условиях реального времени, возможность </w:t>
-      </w:r>
-      <w:proofErr w:type="spellStart"/>
-      <w:r>
-        <w:rPr>
-          <w:rFonts w:asciiTheme="minorHAnsi" w:hAnsiTheme="minorHAnsi" w:cstheme="minorHAnsi"/>
-        </w:rPr>
-        <w:t>дообучения</w:t>
-      </w:r>
-      <w:proofErr w:type="spellEnd"/>
-      <w:r>
-        <w:rPr>
-          <w:rFonts w:asciiTheme="minorHAnsi" w:hAnsiTheme="minorHAnsi" w:cstheme="minorHAnsi"/>
-        </w:rPr>
-        <w:t xml:space="preserve"> и адаптации под разные условия съёмки.</w:t>
-      </w:r>
-    </w:p>
-    <w:p>
-      <w:pPr>
-        <w:pStyle w:val="a4"/>
-        <w:rPr>
-          <w:rFonts w:asciiTheme="minorHAnsi" w:hAnsiTheme="minorHAnsi" w:cstheme="minorHAnsi"/>
-        </w:rPr>
-      </w:pPr>
-      <w:r>
-        <w:rPr>
-          <w:rFonts w:asciiTheme="minorHAnsi" w:hAnsiTheme="minorHAnsi" w:cstheme="minorHAnsi"/>
-        </w:rPr>
-        <w:t>Далее</w:t>
-      </w:r>
-      <w:r>
-        <w:rPr>
-          <w:rFonts w:asciiTheme="minorHAnsi" w:hAnsiTheme="minorHAnsi" w:cstheme="minorHAnsi"/>
-        </w:rPr>
-        <w:t xml:space="preserve"> был проведён </w:t>
+        <w:t>требования к разрабатываем</w:t>
       </w:r>
       <w:r>
         <w:rPr>
@@ -496,7 +330,33 @@
           <w:b/>
           <w:bCs/>
         </w:rPr>
-        <w:t>обзор и выбор</w:t>
+        <w:t>ому приложению</w:t>
+      </w:r>
+      <w:r>
+        <w:rPr>
+          <w:rFonts w:asciiTheme="minorHAnsi" w:hAnsiTheme="minorHAnsi" w:cstheme="minorHAnsi"/>
+        </w:rPr>
+        <w:t>: высокая точность, работа в условиях реального времени, возможность дообучения и адаптации под разные условия съёмки.</w:t>
+      </w:r>
+    </w:p>
+    <w:p>
+      <w:pPr>
+        <w:pStyle w:val="a4"/>
+        <w:rPr>
+          <w:rFonts w:asciiTheme="minorHAnsi" w:hAnsiTheme="minorHAnsi" w:cstheme="minorHAnsi"/>
+        </w:rPr>
+      </w:pPr>
+      <w:r>
+        <w:rPr>
+          <w:rFonts w:asciiTheme="minorHAnsi" w:hAnsiTheme="minorHAnsi" w:cstheme="minorHAnsi"/>
+        </w:rPr>
+        <w:t>Далее</w:t>
+      </w:r>
+      <w:r>
+        <w:rPr>
+          <w:rFonts w:asciiTheme="minorHAnsi" w:hAnsiTheme="minorHAnsi" w:cstheme="minorHAnsi"/>
+        </w:rPr>
+        <w:t xml:space="preserve"> был проведён </w:t>
       </w:r>
       <w:r>
         <w:rPr>
@@ -504,7 +364,7 @@
           <w:b/>
           <w:bCs/>
         </w:rPr>
-        <w:t xml:space="preserve"> различных инструментов</w:t>
+        <w:t>обзор и выбор различных инструментов</w:t>
       </w:r>
       <w:r>
         <w:rPr>
@@ -522,62 +382,44 @@
         <w:rPr>
           <w:rFonts w:asciiTheme="minorHAnsi" w:hAnsiTheme="minorHAnsi" w:cstheme="minorHAnsi"/>
         </w:rPr>
-        <w:t xml:space="preserve">библиотеки для компьютерного зрения, модели для обнаружения объектов и распознавания текста, а также решения для хранения данных. В качестве основного языка был выбран Python как наиболее распространённый в сфере компьютерного зрения. Для детекции объектов выбрано семейство моделей YOLO, так как оно обеспечивает хорошее соотношение скорости и точности. Для распознавания текста изначально использовался </w:t>
-      </w:r>
-      <w:proofErr w:type="spellStart"/>
-      <w:r>
-        <w:rPr>
-          <w:rFonts w:asciiTheme="minorHAnsi" w:hAnsiTheme="minorHAnsi" w:cstheme="minorHAnsi"/>
-        </w:rPr>
-        <w:t>EasyOCR</w:t>
-      </w:r>
-      <w:proofErr w:type="spellEnd"/>
-      <w:r>
-        <w:rPr>
-          <w:rFonts w:asciiTheme="minorHAnsi" w:hAnsiTheme="minorHAnsi" w:cstheme="minorHAnsi"/>
-        </w:rPr>
-        <w:t xml:space="preserve">, но он был заменён на более точный </w:t>
-      </w:r>
-      <w:proofErr w:type="spellStart"/>
-      <w:r>
-        <w:rPr>
-          <w:rFonts w:asciiTheme="minorHAnsi" w:hAnsiTheme="minorHAnsi" w:cstheme="minorHAnsi"/>
-        </w:rPr>
-        <w:t>PaddleOCR</w:t>
-      </w:r>
-      <w:proofErr w:type="spellEnd"/>
-      <w:r>
-        <w:rPr>
-          <w:rFonts w:asciiTheme="minorHAnsi" w:hAnsiTheme="minorHAnsi" w:cstheme="minorHAnsi"/>
-        </w:rPr>
-        <w:t xml:space="preserve"> в связи с неудовлетворительными результатами распознаваний первого варианта на практике</w:t>
-      </w:r>
-      <w:r>
-        <w:rPr>
-          <w:rFonts w:asciiTheme="minorHAnsi" w:hAnsiTheme="minorHAnsi" w:cstheme="minorHAnsi"/>
-        </w:rPr>
-        <w:t xml:space="preserve">. Хранение данных реализовано с </w:t>
+        <w:t>библиотеки для компьютерного зрения, модели для обнаружения объектов и распознавания текста, а также решения для хранения данных. В качестве основного языка был выбран Python как наиболее распространённый в сфере компьютерного зрения. Для детекции объектов выбрано семейство моделей YOLO, так как оно обеспечивает хорошее соотношение скорости и точности</w:t>
+      </w:r>
+      <w:r>
+        <w:rPr>
+          <w:rFonts w:asciiTheme="minorHAnsi" w:hAnsiTheme="minorHAnsi" w:cstheme="minorHAnsi"/>
+        </w:rPr>
+        <w:t xml:space="preserve">, и </w:t>
+      </w:r>
+      <w:r>
+        <w:rPr>
+          <w:rFonts w:asciiTheme="minorHAnsi" w:hAnsiTheme="minorHAnsi" w:cstheme="minorHAnsi"/>
+        </w:rPr>
+        <w:t>позволяет подобрать модель под конкретные требования по производительности</w:t>
+      </w:r>
+      <w:r>
+        <w:rPr>
+          <w:rFonts w:asciiTheme="minorHAnsi" w:hAnsiTheme="minorHAnsi" w:cstheme="minorHAnsi"/>
+        </w:rPr>
+        <w:t>. Для распознавания текста изначально использовался EasyOCR, но он был заменён на более точный PaddleOCR</w:t>
+      </w:r>
+      <w:r>
+        <w:rPr>
+          <w:rFonts w:asciiTheme="minorHAnsi" w:hAnsiTheme="minorHAnsi" w:cstheme="minorHAnsi"/>
+        </w:rPr>
+        <w:t xml:space="preserve"> в связи с неудовлетворительными результатами </w:t>
       </w:r>
       <w:r>
         <w:rPr>
           <w:rFonts w:asciiTheme="minorHAnsi" w:hAnsiTheme="minorHAnsi" w:cstheme="minorHAnsi"/>
         </w:rPr>
         <w:lastRenderedPageBreak/>
-        <w:t xml:space="preserve">использованием </w:t>
-      </w:r>
-      <w:proofErr w:type="spellStart"/>
-      <w:r>
-        <w:rPr>
-          <w:rFonts w:asciiTheme="minorHAnsi" w:hAnsiTheme="minorHAnsi" w:cstheme="minorHAnsi"/>
-        </w:rPr>
-        <w:t>PostgreSQL</w:t>
-      </w:r>
-      <w:proofErr w:type="spellEnd"/>
-      <w:r>
-        <w:rPr>
-          <w:rFonts w:asciiTheme="minorHAnsi" w:hAnsiTheme="minorHAnsi" w:cstheme="minorHAnsi"/>
-        </w:rPr>
-        <w:t>,</w:t>
+        <w:t>распознаваний первого варианта на практике</w:t>
+      </w:r>
+      <w:r>
+        <w:rPr>
+          <w:rFonts w:asciiTheme="minorHAnsi" w:hAnsiTheme="minorHAnsi" w:cstheme="minorHAnsi"/>
+        </w:rPr>
+        <w:t>. Хранение данных реализовано с использованием PostgreSQL,</w:t>
       </w:r>
       <w:r>
         <w:rPr>
@@ -642,27 +484,7 @@
           <w:sz w:val="24"/>
           <w:szCs w:val="24"/>
         </w:rPr>
-        <w:t>реализаци</w:t>
-      </w:r>
-      <w:r>
-        <w:rPr>
-          <w:rFonts w:cstheme="minorHAnsi"/>
-          <w:b/>
-          <w:bCs/>
-          <w:sz w:val="24"/>
-          <w:szCs w:val="24"/>
-        </w:rPr>
-        <w:t>и прототипа</w:t>
-      </w:r>
-      <w:r>
-        <w:rPr>
-          <w:rFonts w:cstheme="minorHAnsi"/>
-          <w:b/>
-          <w:bCs/>
-          <w:sz w:val="24"/>
-          <w:szCs w:val="24"/>
-        </w:rPr>
-        <w:t xml:space="preserve"> приложения</w:t>
+        <w:t>реализации прототипа приложения</w:t>
       </w:r>
       <w:r>
         <w:rPr>
@@ -686,43 +508,7 @@
           <w:sz w:val="24"/>
           <w:szCs w:val="24"/>
         </w:rPr>
-        <w:t xml:space="preserve">.  Сначала была проведена подготовка </w:t>
-      </w:r>
-      <w:proofErr w:type="spellStart"/>
-      <w:r>
-        <w:rPr>
-          <w:rFonts w:cstheme="minorHAnsi"/>
-          <w:sz w:val="24"/>
-          <w:szCs w:val="24"/>
-        </w:rPr>
-        <w:t>датасета</w:t>
-      </w:r>
-      <w:proofErr w:type="spellEnd"/>
-      <w:r>
-        <w:rPr>
-          <w:rFonts w:cstheme="minorHAnsi"/>
-          <w:sz w:val="24"/>
-          <w:szCs w:val="24"/>
-        </w:rPr>
-        <w:t xml:space="preserve">. Для обучения модели детекции номерных знаков были использованы открытые </w:t>
-      </w:r>
-      <w:proofErr w:type="spellStart"/>
-      <w:r>
-        <w:rPr>
-          <w:rFonts w:cstheme="minorHAnsi"/>
-          <w:sz w:val="24"/>
-          <w:szCs w:val="24"/>
-        </w:rPr>
-        <w:t>датасеты</w:t>
-      </w:r>
-      <w:proofErr w:type="spellEnd"/>
-      <w:r>
-        <w:rPr>
-          <w:rFonts w:cstheme="minorHAnsi"/>
-          <w:sz w:val="24"/>
-          <w:szCs w:val="24"/>
-        </w:rPr>
-        <w:t>, изначально предназначенные для сегментации. Их структура была вручную переработана под задачу детекции. Для OCR-модели изображения размечались вручную, включая точный текст каждого номера.</w:t>
+        <w:t>.  Сначала была проведена подготовка датасета. Для обучения модели детекции номерных знаков были использованы открытые датасеты, изначально предназначенные для сегментации. Их структура была вручную переработана под задачу детекции. Для OCR-модели изображения размечались вручную, включая точный текст каждого номера.</w:t>
       </w:r>
       <w:r>
         <w:rPr>
@@ -779,7 +565,31 @@
           <w:sz w:val="24"/>
           <w:szCs w:val="24"/>
         </w:rPr>
-        <w:t>YOLOv8</w:t>
+        <w:t>YOLO</w:t>
+      </w:r>
+      <w:r>
+        <w:rPr>
+          <w:rFonts w:cstheme="minorHAnsi"/>
+          <w:sz w:val="24"/>
+          <w:szCs w:val="24"/>
+        </w:rPr>
+        <w:t xml:space="preserve"> </w:t>
+      </w:r>
+      <w:r>
+        <w:rPr>
+          <w:rFonts w:cstheme="minorHAnsi"/>
+          <w:sz w:val="24"/>
+          <w:szCs w:val="24"/>
+        </w:rPr>
+        <w:t>8</w:t>
+      </w:r>
+      <w:r>
+        <w:rPr>
+          <w:rFonts w:cstheme="minorHAnsi"/>
+          <w:sz w:val="24"/>
+          <w:szCs w:val="24"/>
+        </w:rPr>
+        <w:t xml:space="preserve"> версии в конфигурации </w:t>
       </w:r>
       <w:r>
         <w:rPr>
@@ -788,33 +598,23 @@
           <w:szCs w:val="24"/>
           <w:lang w:val="en-US"/>
         </w:rPr>
-        <w:t>s</w:t>
-      </w:r>
-      <w:r>
-        <w:rPr>
-          <w:rFonts w:cstheme="minorHAnsi"/>
-          <w:sz w:val="24"/>
-          <w:szCs w:val="24"/>
-        </w:rPr>
-        <w:t xml:space="preserve"> в качестве </w:t>
-      </w:r>
-      <w:proofErr w:type="spellStart"/>
-      <w:r>
-        <w:rPr>
-          <w:rFonts w:cstheme="minorHAnsi"/>
-          <w:sz w:val="24"/>
-          <w:szCs w:val="24"/>
-        </w:rPr>
-        <w:t>предобученных</w:t>
-      </w:r>
-      <w:proofErr w:type="spellEnd"/>
-      <w:r>
-        <w:rPr>
-          <w:rFonts w:cstheme="minorHAnsi"/>
-          <w:sz w:val="24"/>
-          <w:szCs w:val="24"/>
-        </w:rPr>
-        <w:t xml:space="preserve"> весов.</w:t>
+        <w:t>small</w:t>
+      </w:r>
+      <w:r>
+        <w:rPr>
+          <w:rFonts w:cstheme="minorHAnsi"/>
+          <w:sz w:val="24"/>
+          <w:szCs w:val="24"/>
+        </w:rPr>
+        <w:t xml:space="preserve"> </w:t>
+      </w:r>
+      <w:r>
+        <w:rPr>
+          <w:rFonts w:cstheme="minorHAnsi"/>
+          <w:sz w:val="24"/>
+          <w:szCs w:val="24"/>
+        </w:rPr>
+        <w:t>в качестве предобученных весов.</w:t>
       </w:r>
       <w:r>
         <w:rPr>

</xml_diff>

<commit_message>
change slides and speech
</commit_message>
<xml_diff>
--- a/speech.docx
+++ b/speech.docx
@@ -4,19 +4,87 @@
   <w:body>
     <w:p>
       <w:pPr>
-        <w:rPr>
-          <w:rFonts w:cstheme="minorHAnsi"/>
-          <w:sz w:val="24"/>
-          <w:szCs w:val="24"/>
-        </w:rPr>
-      </w:pPr>
-      <w:r>
-        <w:rPr>
-          <w:rFonts w:cstheme="minorHAnsi"/>
-          <w:sz w:val="24"/>
-          <w:szCs w:val="24"/>
-        </w:rPr>
-        <w:t>Меня зовут Плугин Олег, и я представляю свою выпускную квалификационную работу по теме «Разработка модели распознавания автомобильных номеров на основе технологий компьютерного зрения».</w:t>
+        <w:pStyle w:val="a5"/>
+      </w:pPr>
+      <w:r>
+        <w:t>Слайд 1</w:t>
+      </w:r>
+    </w:p>
+    <w:p>
+      <w:pPr>
+        <w:rPr>
+          <w:rFonts w:cstheme="minorHAnsi"/>
+          <w:sz w:val="24"/>
+          <w:szCs w:val="24"/>
+        </w:rPr>
+      </w:pPr>
+      <w:r>
+        <w:rPr>
+          <w:rFonts w:cstheme="minorHAnsi"/>
+          <w:sz w:val="24"/>
+          <w:szCs w:val="24"/>
+        </w:rPr>
+        <w:t xml:space="preserve">Меня зовут </w:t>
+      </w:r>
+      <w:proofErr w:type="spellStart"/>
+      <w:r>
+        <w:rPr>
+          <w:rFonts w:cstheme="minorHAnsi"/>
+          <w:sz w:val="24"/>
+          <w:szCs w:val="24"/>
+        </w:rPr>
+        <w:t>Плугин</w:t>
+      </w:r>
+      <w:proofErr w:type="spellEnd"/>
+      <w:r>
+        <w:rPr>
+          <w:rFonts w:cstheme="minorHAnsi"/>
+          <w:sz w:val="24"/>
+          <w:szCs w:val="24"/>
+        </w:rPr>
+        <w:t xml:space="preserve"> Олег, и я представляю свою выпускную квалификационную работу по теме «Разработка модели распознавания автомобильных номеров на основе технологий компьютерного зрения».</w:t>
+      </w:r>
+      <w:r>
+        <w:rPr>
+          <w:rFonts w:cstheme="minorHAnsi"/>
+          <w:sz w:val="24"/>
+          <w:szCs w:val="24"/>
+        </w:rPr>
+        <w:t xml:space="preserve"> Моим научным руководителем является </w:t>
+      </w:r>
+      <w:r>
+        <w:rPr>
+          <w:rFonts w:cstheme="minorHAnsi"/>
+          <w:sz w:val="24"/>
+          <w:szCs w:val="24"/>
+        </w:rPr>
+        <w:t xml:space="preserve">Корзун Дмитрий </w:t>
+      </w:r>
+      <w:proofErr w:type="spellStart"/>
+      <w:r>
+        <w:rPr>
+          <w:rFonts w:cstheme="minorHAnsi"/>
+          <w:sz w:val="24"/>
+          <w:szCs w:val="24"/>
+        </w:rPr>
+        <w:t>Жоржевич</w:t>
+      </w:r>
+      <w:proofErr w:type="spellEnd"/>
+      <w:r>
+        <w:rPr>
+          <w:rFonts w:cstheme="minorHAnsi"/>
+          <w:sz w:val="24"/>
+          <w:szCs w:val="24"/>
+        </w:rPr>
+        <w:t>.</w:t>
+      </w:r>
+    </w:p>
+    <w:p>
+      <w:pPr>
+        <w:pStyle w:val="a5"/>
+      </w:pPr>
+      <w:r>
+        <w:t>Слайд 2</w:t>
       </w:r>
     </w:p>
     <w:p>
@@ -35,7 +103,17 @@
           <w:sz w:val="24"/>
           <w:szCs w:val="24"/>
         </w:rPr>
-        <w:t>Главной целью</w:t>
+        <w:t>Г</w:t>
+      </w:r>
+      <w:r>
+        <w:rPr>
+          <w:rFonts w:cstheme="minorHAnsi"/>
+          <w:b/>
+          <w:bCs/>
+          <w:sz w:val="24"/>
+          <w:szCs w:val="24"/>
+        </w:rPr>
+        <w:t>лавной целью</w:t>
       </w:r>
       <w:r>
         <w:rPr>
@@ -149,12 +227,11 @@
     </w:p>
     <w:p>
       <w:pPr>
-        <w:rPr>
-          <w:rFonts w:cstheme="minorHAnsi"/>
-          <w:sz w:val="24"/>
-          <w:szCs w:val="24"/>
-        </w:rPr>
-      </w:pPr>
+        <w:pStyle w:val="a5"/>
+      </w:pPr>
+      <w:r>
+        <w:t>Слайд 3</w:t>
+      </w:r>
     </w:p>
     <w:p>
       <w:pPr>
@@ -250,232 +327,139 @@
     </w:p>
     <w:p>
       <w:pPr>
-        <w:pStyle w:val="a4"/>
-        <w:rPr>
-          <w:rFonts w:asciiTheme="minorHAnsi" w:hAnsiTheme="minorHAnsi" w:cstheme="minorHAnsi"/>
-        </w:rPr>
-      </w:pPr>
-      <w:r>
-        <w:rPr>
-          <w:rFonts w:asciiTheme="minorHAnsi" w:hAnsiTheme="minorHAnsi" w:cstheme="minorHAnsi"/>
-        </w:rPr>
-        <w:t xml:space="preserve">В рамках </w:t>
-      </w:r>
-      <w:r>
-        <w:rPr>
-          <w:rFonts w:asciiTheme="minorHAnsi" w:hAnsiTheme="minorHAnsi" w:cstheme="minorHAnsi"/>
+        <w:pStyle w:val="a5"/>
+      </w:pPr>
+      <w:r>
+        <w:t>Слайд 4</w:t>
+      </w:r>
+    </w:p>
+    <w:p>
+      <w:pPr>
+        <w:rPr>
+          <w:rFonts w:cstheme="minorHAnsi"/>
+          <w:sz w:val="24"/>
+          <w:szCs w:val="24"/>
+        </w:rPr>
+      </w:pPr>
+      <w:r>
+        <w:rPr>
+          <w:rFonts w:cstheme="minorHAnsi"/>
+          <w:sz w:val="24"/>
+          <w:szCs w:val="24"/>
+        </w:rPr>
+        <w:t xml:space="preserve">На данном слайде представлены </w:t>
+      </w:r>
+      <w:r>
+        <w:rPr>
+          <w:rFonts w:cstheme="minorHAnsi"/>
           <w:b/>
           <w:bCs/>
-        </w:rPr>
-        <w:t>обзора существующих решений</w:t>
-      </w:r>
-      <w:r>
-        <w:rPr>
-          <w:rFonts w:asciiTheme="minorHAnsi" w:hAnsiTheme="minorHAnsi" w:cstheme="minorHAnsi"/>
-        </w:rPr>
-        <w:t xml:space="preserve"> были изучены как российские системы, например, ПОТОК и AutoTRASSIR, так и зарубежные — такие как OpenALPR и </w:t>
-      </w:r>
-      <w:r>
-        <w:rPr>
-          <w:rFonts w:asciiTheme="minorHAnsi" w:hAnsiTheme="minorHAnsi" w:cstheme="minorHAnsi"/>
-          <w:lang w:val="en-US"/>
-        </w:rPr>
-        <w:t>POLISCAN</w:t>
-      </w:r>
-      <w:r>
-        <w:rPr>
-          <w:rFonts w:asciiTheme="minorHAnsi" w:hAnsiTheme="minorHAnsi" w:cstheme="minorHAnsi"/>
-        </w:rPr>
-        <w:t>. Для исследования использовались критерии: точность, стоимость внедрения и используемые технологии.</w:t>
-      </w:r>
-    </w:p>
-    <w:p>
-      <w:pPr>
-        <w:pStyle w:val="a4"/>
-        <w:rPr>
-          <w:rFonts w:asciiTheme="minorHAnsi" w:hAnsiTheme="minorHAnsi" w:cstheme="minorHAnsi"/>
-        </w:rPr>
-      </w:pPr>
-      <w:r>
-        <w:rPr>
-          <w:rFonts w:asciiTheme="minorHAnsi" w:hAnsiTheme="minorHAnsi" w:cstheme="minorHAnsi"/>
-        </w:rPr>
-        <w:t>На слайде представлены примеры пользовательских интерфейсов рассмотренных решений.</w:t>
-      </w:r>
-    </w:p>
-    <w:p>
-      <w:pPr>
-        <w:pStyle w:val="a4"/>
-        <w:rPr>
-          <w:rFonts w:asciiTheme="minorHAnsi" w:hAnsiTheme="minorHAnsi" w:cstheme="minorHAnsi"/>
-        </w:rPr>
-      </w:pPr>
-      <w:r>
-        <w:rPr>
-          <w:rFonts w:asciiTheme="minorHAnsi" w:hAnsiTheme="minorHAnsi" w:cstheme="minorHAnsi"/>
-        </w:rPr>
-        <w:t xml:space="preserve">На основании обзора сформулированы </w:t>
-      </w:r>
-      <w:r>
-        <w:rPr>
-          <w:rFonts w:asciiTheme="minorHAnsi" w:hAnsiTheme="minorHAnsi" w:cstheme="minorHAnsi"/>
+          <w:sz w:val="24"/>
+          <w:szCs w:val="24"/>
+        </w:rPr>
+        <w:t>три архитектуры</w:t>
+      </w:r>
+      <w:r>
+        <w:rPr>
+          <w:rFonts w:cstheme="minorHAnsi"/>
+          <w:sz w:val="24"/>
+          <w:szCs w:val="24"/>
+        </w:rPr>
+        <w:t xml:space="preserve"> для детекции объектов: YOLO, SSD и </w:t>
+      </w:r>
+      <w:proofErr w:type="spellStart"/>
+      <w:r>
+        <w:rPr>
+          <w:rFonts w:cstheme="minorHAnsi"/>
+          <w:sz w:val="24"/>
+          <w:szCs w:val="24"/>
+        </w:rPr>
+        <w:t>Faster</w:t>
+      </w:r>
+      <w:proofErr w:type="spellEnd"/>
+      <w:r>
+        <w:rPr>
+          <w:rFonts w:cstheme="minorHAnsi"/>
+          <w:sz w:val="24"/>
+          <w:szCs w:val="24"/>
+        </w:rPr>
+        <w:t xml:space="preserve"> R-CNN. </w:t>
+      </w:r>
+    </w:p>
+    <w:p>
+      <w:pPr>
+        <w:rPr>
+          <w:rFonts w:cstheme="minorHAnsi"/>
+          <w:sz w:val="24"/>
+          <w:szCs w:val="24"/>
+        </w:rPr>
+      </w:pPr>
+      <w:r>
+        <w:rPr>
+          <w:rFonts w:cstheme="minorHAnsi"/>
           <w:b/>
           <w:bCs/>
-        </w:rPr>
-        <w:t>требования к разрабатываем</w:t>
-      </w:r>
-      <w:r>
-        <w:rPr>
-          <w:rFonts w:asciiTheme="minorHAnsi" w:hAnsiTheme="minorHAnsi" w:cstheme="minorHAnsi"/>
+          <w:sz w:val="24"/>
+          <w:szCs w:val="24"/>
+        </w:rPr>
+        <w:t>YOLO</w:t>
+      </w:r>
+      <w:r>
+        <w:rPr>
+          <w:rFonts w:cstheme="minorHAnsi"/>
+          <w:sz w:val="24"/>
+          <w:szCs w:val="24"/>
+        </w:rPr>
+        <w:t xml:space="preserve"> — это быстрая одноэтапная модель, хорошо подходящая для задач реального времени, например, видеонаблюдения. Она предсказывает рамки и классы сразу по всей сетке изображения. </w:t>
+      </w:r>
+    </w:p>
+    <w:p>
+      <w:pPr>
+        <w:rPr>
+          <w:rFonts w:cstheme="minorHAnsi"/>
+          <w:sz w:val="24"/>
+          <w:szCs w:val="24"/>
+        </w:rPr>
+      </w:pPr>
+      <w:r>
+        <w:rPr>
+          <w:rFonts w:cstheme="minorHAnsi"/>
           <w:b/>
           <w:bCs/>
-        </w:rPr>
-        <w:t>ому приложению</w:t>
-      </w:r>
-      <w:r>
-        <w:rPr>
-          <w:rFonts w:asciiTheme="minorHAnsi" w:hAnsiTheme="minorHAnsi" w:cstheme="minorHAnsi"/>
-        </w:rPr>
-        <w:t>: высокая точность, работа в условиях реального времени, возможность дообучения и адаптации под разные условия съёмки.</w:t>
-      </w:r>
-    </w:p>
-    <w:p>
-      <w:pPr>
-        <w:pStyle w:val="a4"/>
-        <w:rPr>
-          <w:rFonts w:asciiTheme="minorHAnsi" w:hAnsiTheme="minorHAnsi" w:cstheme="minorHAnsi"/>
-        </w:rPr>
-      </w:pPr>
-      <w:r>
-        <w:rPr>
-          <w:rFonts w:asciiTheme="minorHAnsi" w:hAnsiTheme="minorHAnsi" w:cstheme="minorHAnsi"/>
-        </w:rPr>
-        <w:t>Далее</w:t>
-      </w:r>
-      <w:r>
-        <w:rPr>
-          <w:rFonts w:asciiTheme="minorHAnsi" w:hAnsiTheme="minorHAnsi" w:cstheme="minorHAnsi"/>
-        </w:rPr>
-        <w:t xml:space="preserve"> был проведён </w:t>
-      </w:r>
-      <w:r>
-        <w:rPr>
-          <w:rFonts w:asciiTheme="minorHAnsi" w:hAnsiTheme="minorHAnsi" w:cstheme="minorHAnsi"/>
+          <w:sz w:val="24"/>
+          <w:szCs w:val="24"/>
+        </w:rPr>
+        <w:t>SSD</w:t>
+      </w:r>
+      <w:r>
+        <w:rPr>
+          <w:rFonts w:cstheme="minorHAnsi"/>
+          <w:sz w:val="24"/>
+          <w:szCs w:val="24"/>
+        </w:rPr>
+        <w:t xml:space="preserve"> также одноэтапная, но использует несколько уровней признаков и якорные рамки разного масштаба. Это позволяет достичь баланса между точностью и скоростью. </w:t>
+      </w:r>
+    </w:p>
+    <w:p>
+      <w:pPr>
+        <w:rPr>
+          <w:rFonts w:cstheme="minorHAnsi"/>
+          <w:sz w:val="24"/>
+          <w:szCs w:val="24"/>
+        </w:rPr>
+      </w:pPr>
+      <w:proofErr w:type="spellStart"/>
+      <w:r>
+        <w:rPr>
+          <w:rFonts w:cstheme="minorHAnsi"/>
           <w:b/>
           <w:bCs/>
-        </w:rPr>
-        <w:t>обзор и выбор различных инструментов</w:t>
-      </w:r>
-      <w:r>
-        <w:rPr>
-          <w:rFonts w:asciiTheme="minorHAnsi" w:hAnsiTheme="minorHAnsi" w:cstheme="minorHAnsi"/>
-        </w:rPr>
-        <w:t xml:space="preserve">, подходящих для реализации системы. Сравнивались языки программирования, </w:t>
-      </w:r>
-      <w:r>
-        <w:rPr>
-          <w:rFonts w:asciiTheme="minorHAnsi" w:hAnsiTheme="minorHAnsi" w:cstheme="minorHAnsi"/>
-        </w:rPr>
-        <w:t xml:space="preserve">основные </w:t>
-      </w:r>
-      <w:r>
-        <w:rPr>
-          <w:rFonts w:asciiTheme="minorHAnsi" w:hAnsiTheme="minorHAnsi" w:cstheme="minorHAnsi"/>
-        </w:rPr>
-        <w:t>библиотеки для компьютерного зрения, модели для обнаружения объектов и распознавания текста, а также решения для хранения данных. В качестве основного языка был выбран Python как наиболее распространённый в сфере компьютерного зрения. Для детекции объектов выбрано семейство моделей YOLO, так как оно обеспечивает хорошее соотношение скорости и точности</w:t>
-      </w:r>
-      <w:r>
-        <w:rPr>
-          <w:rFonts w:asciiTheme="minorHAnsi" w:hAnsiTheme="minorHAnsi" w:cstheme="minorHAnsi"/>
-        </w:rPr>
-        <w:t xml:space="preserve">, и </w:t>
-      </w:r>
-      <w:r>
-        <w:rPr>
-          <w:rFonts w:asciiTheme="minorHAnsi" w:hAnsiTheme="minorHAnsi" w:cstheme="minorHAnsi"/>
-        </w:rPr>
-        <w:t>позволяет подобрать модель под конкретные требования по производительности</w:t>
-      </w:r>
-      <w:r>
-        <w:rPr>
-          <w:rFonts w:asciiTheme="minorHAnsi" w:hAnsiTheme="minorHAnsi" w:cstheme="minorHAnsi"/>
-        </w:rPr>
-        <w:t>. Для распознавания текста изначально использовался EasyOCR, но он был заменён на более точный PaddleOCR</w:t>
-      </w:r>
-      <w:r>
-        <w:rPr>
-          <w:rFonts w:asciiTheme="minorHAnsi" w:hAnsiTheme="minorHAnsi" w:cstheme="minorHAnsi"/>
-        </w:rPr>
-        <w:t xml:space="preserve"> в связи с неудовлетворительными результатами </w:t>
-      </w:r>
-      <w:r>
-        <w:rPr>
-          <w:rFonts w:asciiTheme="minorHAnsi" w:hAnsiTheme="minorHAnsi" w:cstheme="minorHAnsi"/>
-        </w:rPr>
-        <w:lastRenderedPageBreak/>
-        <w:t>распознаваний первого варианта на практике</w:t>
-      </w:r>
-      <w:r>
-        <w:rPr>
-          <w:rFonts w:asciiTheme="minorHAnsi" w:hAnsiTheme="minorHAnsi" w:cstheme="minorHAnsi"/>
-        </w:rPr>
-        <w:t>. Хранение данных реализовано с использованием PostgreSQL,</w:t>
-      </w:r>
-      <w:r>
-        <w:rPr>
-          <w:rFonts w:asciiTheme="minorHAnsi" w:hAnsiTheme="minorHAnsi" w:cstheme="minorHAnsi"/>
-        </w:rPr>
-        <w:t xml:space="preserve"> что позволит использовать асинхронные запросы к базе данных для ускорения приложения,</w:t>
-      </w:r>
-      <w:r>
-        <w:rPr>
-          <w:rFonts w:asciiTheme="minorHAnsi" w:hAnsiTheme="minorHAnsi" w:cstheme="minorHAnsi"/>
-        </w:rPr>
-        <w:t xml:space="preserve"> а асинхронн</w:t>
-      </w:r>
-      <w:r>
-        <w:rPr>
-          <w:rFonts w:asciiTheme="minorHAnsi" w:hAnsiTheme="minorHAnsi" w:cstheme="minorHAnsi"/>
-        </w:rPr>
-        <w:t>ое распознавание текста с полученных автомобильных номеров позволит не останавливать основной поток распознавания регистрационных знаков с видеоряда, что также служит для повышения производительности</w:t>
-      </w:r>
-      <w:r>
-        <w:rPr>
-          <w:rFonts w:asciiTheme="minorHAnsi" w:hAnsiTheme="minorHAnsi" w:cstheme="minorHAnsi"/>
-        </w:rPr>
-        <w:t xml:space="preserve">. Это создает основу для реализации </w:t>
-      </w:r>
-      <w:r>
-        <w:rPr>
-          <w:rFonts w:asciiTheme="minorHAnsi" w:hAnsiTheme="minorHAnsi" w:cstheme="minorHAnsi"/>
-        </w:rPr>
-        <w:t>прототипа приложения для практического применения.</w:t>
-      </w:r>
-    </w:p>
-    <w:p>
-      <w:pPr>
-        <w:rPr>
-          <w:rFonts w:cstheme="minorHAnsi"/>
-          <w:sz w:val="24"/>
-          <w:szCs w:val="24"/>
-        </w:rPr>
-      </w:pPr>
-      <w:r>
-        <w:rPr>
-          <w:rFonts w:cstheme="minorHAnsi"/>
-          <w:sz w:val="24"/>
-          <w:szCs w:val="24"/>
-        </w:rPr>
-        <w:t>Следующий этап посвящен</w:t>
-      </w:r>
-      <w:r>
-        <w:rPr>
-          <w:rFonts w:cstheme="minorHAnsi"/>
-          <w:sz w:val="24"/>
-          <w:szCs w:val="24"/>
-        </w:rPr>
-        <w:t xml:space="preserve"> </w:t>
-      </w:r>
+          <w:sz w:val="24"/>
+          <w:szCs w:val="24"/>
+        </w:rPr>
+        <w:t>Faster</w:t>
+      </w:r>
+      <w:proofErr w:type="spellEnd"/>
       <w:r>
         <w:rPr>
           <w:rFonts w:cstheme="minorHAnsi"/>
@@ -484,6 +468,681 @@
           <w:sz w:val="24"/>
           <w:szCs w:val="24"/>
         </w:rPr>
+        <w:t xml:space="preserve"> R-CNN</w:t>
+      </w:r>
+      <w:r>
+        <w:rPr>
+          <w:rFonts w:cstheme="minorHAnsi"/>
+          <w:sz w:val="24"/>
+          <w:szCs w:val="24"/>
+        </w:rPr>
+        <w:t xml:space="preserve"> — </w:t>
+      </w:r>
+      <w:r>
+        <w:rPr>
+          <w:rFonts w:cstheme="minorHAnsi"/>
+          <w:sz w:val="24"/>
+          <w:szCs w:val="24"/>
+        </w:rPr>
+        <w:t>двухэтапная</w:t>
+      </w:r>
+      <w:r>
+        <w:rPr>
+          <w:rFonts w:cstheme="minorHAnsi"/>
+          <w:sz w:val="24"/>
+          <w:szCs w:val="24"/>
+        </w:rPr>
+        <w:t xml:space="preserve"> модель: сначала она выделяет области интереса, а затем классифицирует их. Это обеспечивает высокую точность, но в ущерб скорости. </w:t>
+      </w:r>
+    </w:p>
+    <w:p>
+      <w:pPr>
+        <w:rPr>
+          <w:rFonts w:cstheme="minorHAnsi"/>
+          <w:sz w:val="24"/>
+          <w:szCs w:val="24"/>
+        </w:rPr>
+      </w:pPr>
+      <w:r>
+        <w:rPr>
+          <w:rFonts w:cstheme="minorHAnsi"/>
+          <w:sz w:val="24"/>
+          <w:szCs w:val="24"/>
+        </w:rPr>
+        <w:t xml:space="preserve">В таблице ниже </w:t>
+      </w:r>
+      <w:r>
+        <w:rPr>
+          <w:rFonts w:cstheme="minorHAnsi"/>
+          <w:sz w:val="24"/>
+          <w:szCs w:val="24"/>
+        </w:rPr>
+        <w:t xml:space="preserve">показаны </w:t>
+      </w:r>
+      <w:r>
+        <w:rPr>
+          <w:rFonts w:cstheme="minorHAnsi"/>
+          <w:sz w:val="24"/>
+          <w:szCs w:val="24"/>
+        </w:rPr>
+        <w:t xml:space="preserve">результаты на тестовом </w:t>
+      </w:r>
+      <w:r>
+        <w:rPr>
+          <w:rFonts w:cstheme="minorHAnsi"/>
+          <w:sz w:val="24"/>
+          <w:szCs w:val="24"/>
+        </w:rPr>
+        <w:t xml:space="preserve">испытании </w:t>
+      </w:r>
+      <w:r>
+        <w:rPr>
+          <w:rFonts w:cstheme="minorHAnsi"/>
+          <w:sz w:val="24"/>
+          <w:szCs w:val="24"/>
+        </w:rPr>
+        <w:t>VOC2007</w:t>
+      </w:r>
+      <w:r>
+        <w:rPr>
+          <w:rFonts w:cstheme="minorHAnsi"/>
+          <w:sz w:val="24"/>
+          <w:szCs w:val="24"/>
+        </w:rPr>
+        <w:t>.</w:t>
+      </w:r>
+    </w:p>
+    <w:p>
+      <w:pPr>
+        <w:rPr>
+          <w:rFonts w:cstheme="minorHAnsi"/>
+          <w:sz w:val="24"/>
+          <w:szCs w:val="24"/>
+        </w:rPr>
+      </w:pPr>
+      <w:r>
+        <w:rPr>
+          <w:rFonts w:cstheme="minorHAnsi"/>
+          <w:b/>
+          <w:bCs/>
+          <w:color w:val="FF0000"/>
+          <w:sz w:val="24"/>
+          <w:szCs w:val="24"/>
+          <w:lang w:val="en-US"/>
+        </w:rPr>
+        <w:t>P</w:t>
+      </w:r>
+      <w:r>
+        <w:rPr>
+          <w:rFonts w:cstheme="minorHAnsi"/>
+          <w:b/>
+          <w:bCs/>
+          <w:color w:val="FF0000"/>
+          <w:sz w:val="24"/>
+          <w:szCs w:val="24"/>
+        </w:rPr>
+        <w:t>.</w:t>
+      </w:r>
+      <w:r>
+        <w:rPr>
+          <w:rFonts w:cstheme="minorHAnsi"/>
+          <w:b/>
+          <w:bCs/>
+          <w:color w:val="FF0000"/>
+          <w:sz w:val="24"/>
+          <w:szCs w:val="24"/>
+          <w:lang w:val="en-US"/>
+        </w:rPr>
+        <w:t>s</w:t>
+      </w:r>
+      <w:r>
+        <w:rPr>
+          <w:rFonts w:cstheme="minorHAnsi"/>
+          <w:b/>
+          <w:bCs/>
+          <w:color w:val="FF0000"/>
+          <w:sz w:val="24"/>
+          <w:szCs w:val="24"/>
+        </w:rPr>
+        <w:t xml:space="preserve">. </w:t>
+      </w:r>
+      <w:r>
+        <w:rPr>
+          <w:rFonts w:cstheme="minorHAnsi"/>
+          <w:b/>
+          <w:bCs/>
+          <w:color w:val="FF0000"/>
+          <w:sz w:val="24"/>
+          <w:szCs w:val="24"/>
+          <w:lang w:val="en-US"/>
+        </w:rPr>
+        <w:t>VOC</w:t>
+      </w:r>
+      <w:r>
+        <w:rPr>
+          <w:rFonts w:cstheme="minorHAnsi"/>
+          <w:b/>
+          <w:bCs/>
+          <w:color w:val="FF0000"/>
+          <w:sz w:val="24"/>
+          <w:szCs w:val="24"/>
+        </w:rPr>
+        <w:t>2007 (</w:t>
+      </w:r>
+      <w:r>
+        <w:rPr>
+          <w:rFonts w:cstheme="minorHAnsi"/>
+          <w:b/>
+          <w:bCs/>
+          <w:color w:val="FF0000"/>
+          <w:sz w:val="24"/>
+          <w:szCs w:val="24"/>
+          <w:lang w:val="en-US"/>
+        </w:rPr>
+        <w:t>Visual</w:t>
+      </w:r>
+      <w:r>
+        <w:rPr>
+          <w:rFonts w:cstheme="minorHAnsi"/>
+          <w:b/>
+          <w:bCs/>
+          <w:color w:val="FF0000"/>
+          <w:sz w:val="24"/>
+          <w:szCs w:val="24"/>
+        </w:rPr>
+        <w:t xml:space="preserve"> </w:t>
+      </w:r>
+      <w:r>
+        <w:rPr>
+          <w:rFonts w:cstheme="minorHAnsi"/>
+          <w:b/>
+          <w:bCs/>
+          <w:color w:val="FF0000"/>
+          <w:sz w:val="24"/>
+          <w:szCs w:val="24"/>
+          <w:lang w:val="en-US"/>
+        </w:rPr>
+        <w:t>Object</w:t>
+      </w:r>
+      <w:r>
+        <w:rPr>
+          <w:rFonts w:cstheme="minorHAnsi"/>
+          <w:b/>
+          <w:bCs/>
+          <w:color w:val="FF0000"/>
+          <w:sz w:val="24"/>
+          <w:szCs w:val="24"/>
+        </w:rPr>
+        <w:t xml:space="preserve"> </w:t>
+      </w:r>
+      <w:r>
+        <w:rPr>
+          <w:rFonts w:cstheme="minorHAnsi"/>
+          <w:b/>
+          <w:bCs/>
+          <w:color w:val="FF0000"/>
+          <w:sz w:val="24"/>
+          <w:szCs w:val="24"/>
+          <w:lang w:val="en-US"/>
+        </w:rPr>
+        <w:t>Classes</w:t>
+      </w:r>
+      <w:r>
+        <w:rPr>
+          <w:rFonts w:cstheme="minorHAnsi"/>
+          <w:b/>
+          <w:bCs/>
+          <w:color w:val="FF0000"/>
+          <w:sz w:val="24"/>
+          <w:szCs w:val="24"/>
+        </w:rPr>
+        <w:t xml:space="preserve"> </w:t>
+      </w:r>
+      <w:r>
+        <w:rPr>
+          <w:rFonts w:cstheme="minorHAnsi"/>
+          <w:b/>
+          <w:bCs/>
+          <w:color w:val="FF0000"/>
+          <w:sz w:val="24"/>
+          <w:szCs w:val="24"/>
+          <w:lang w:val="en-US"/>
+        </w:rPr>
+        <w:t>Challenge</w:t>
+      </w:r>
+      <w:r>
+        <w:rPr>
+          <w:rFonts w:cstheme="minorHAnsi"/>
+          <w:b/>
+          <w:bCs/>
+          <w:color w:val="FF0000"/>
+          <w:sz w:val="24"/>
+          <w:szCs w:val="24"/>
+        </w:rPr>
+        <w:t xml:space="preserve"> 2007)</w:t>
+      </w:r>
+      <w:r>
+        <w:rPr>
+          <w:rFonts w:cstheme="minorHAnsi"/>
+          <w:color w:val="FF0000"/>
+          <w:sz w:val="24"/>
+          <w:szCs w:val="24"/>
+        </w:rPr>
+        <w:t xml:space="preserve"> </w:t>
+      </w:r>
+      <w:r>
+        <w:rPr>
+          <w:rFonts w:cstheme="minorHAnsi"/>
+          <w:sz w:val="24"/>
+          <w:szCs w:val="24"/>
+        </w:rPr>
+        <w:t xml:space="preserve">– </w:t>
+      </w:r>
+      <w:r>
+        <w:rPr>
+          <w:rFonts w:cstheme="minorHAnsi"/>
+          <w:sz w:val="24"/>
+          <w:szCs w:val="24"/>
+        </w:rPr>
+        <w:t xml:space="preserve">один из </w:t>
+      </w:r>
+      <w:proofErr w:type="spellStart"/>
+      <w:r>
+        <w:rPr>
+          <w:rFonts w:cstheme="minorHAnsi"/>
+          <w:sz w:val="24"/>
+          <w:szCs w:val="24"/>
+        </w:rPr>
+        <w:t>датасет</w:t>
+      </w:r>
+      <w:r>
+        <w:rPr>
+          <w:rFonts w:cstheme="minorHAnsi"/>
+          <w:sz w:val="24"/>
+          <w:szCs w:val="24"/>
+        </w:rPr>
+        <w:t>ов</w:t>
+      </w:r>
+      <w:proofErr w:type="spellEnd"/>
+      <w:r>
+        <w:rPr>
+          <w:rFonts w:cstheme="minorHAnsi"/>
+          <w:sz w:val="24"/>
+          <w:szCs w:val="24"/>
+        </w:rPr>
+        <w:t xml:space="preserve"> </w:t>
+      </w:r>
+      <w:r>
+        <w:rPr>
+          <w:rFonts w:cstheme="minorHAnsi"/>
+          <w:sz w:val="24"/>
+          <w:szCs w:val="24"/>
+        </w:rPr>
+        <w:t>для оценки алгоритмов детекции объектов</w:t>
+      </w:r>
+      <w:r>
+        <w:rPr>
+          <w:rFonts w:cstheme="minorHAnsi"/>
+          <w:sz w:val="24"/>
+          <w:szCs w:val="24"/>
+        </w:rPr>
+        <w:t>.</w:t>
+      </w:r>
+    </w:p>
+    <w:p>
+      <w:pPr>
+        <w:rPr>
+          <w:rFonts w:cstheme="minorHAnsi"/>
+          <w:sz w:val="24"/>
+          <w:szCs w:val="24"/>
+        </w:rPr>
+      </w:pPr>
+    </w:p>
+    <w:p>
+      <w:pPr>
+        <w:pStyle w:val="a5"/>
+      </w:pPr>
+      <w:r>
+        <w:t>Слайд 5</w:t>
+      </w:r>
+    </w:p>
+    <w:p>
+      <w:pPr>
+        <w:pStyle w:val="a4"/>
+        <w:rPr>
+          <w:rFonts w:asciiTheme="minorHAnsi" w:hAnsiTheme="minorHAnsi" w:cstheme="minorHAnsi"/>
+        </w:rPr>
+      </w:pPr>
+      <w:r>
+        <w:rPr>
+          <w:rFonts w:asciiTheme="minorHAnsi" w:hAnsiTheme="minorHAnsi" w:cstheme="minorHAnsi"/>
+        </w:rPr>
+        <w:t xml:space="preserve">В рамках </w:t>
+      </w:r>
+      <w:r>
+        <w:rPr>
+          <w:rFonts w:asciiTheme="minorHAnsi" w:hAnsiTheme="minorHAnsi" w:cstheme="minorHAnsi"/>
+          <w:b/>
+          <w:bCs/>
+        </w:rPr>
+        <w:t>обзора существующих решений</w:t>
+      </w:r>
+      <w:r>
+        <w:rPr>
+          <w:rFonts w:asciiTheme="minorHAnsi" w:hAnsiTheme="minorHAnsi" w:cstheme="minorHAnsi"/>
+        </w:rPr>
+        <w:t xml:space="preserve"> были изучены как российские системы, например, ПОТОК и </w:t>
+      </w:r>
+      <w:proofErr w:type="spellStart"/>
+      <w:r>
+        <w:rPr>
+          <w:rFonts w:asciiTheme="minorHAnsi" w:hAnsiTheme="minorHAnsi" w:cstheme="minorHAnsi"/>
+        </w:rPr>
+        <w:t>AutoTRASSIR</w:t>
+      </w:r>
+      <w:proofErr w:type="spellEnd"/>
+      <w:r>
+        <w:rPr>
+          <w:rFonts w:asciiTheme="minorHAnsi" w:hAnsiTheme="minorHAnsi" w:cstheme="minorHAnsi"/>
+        </w:rPr>
+        <w:t xml:space="preserve">, так и зарубежные — такие как </w:t>
+      </w:r>
+      <w:proofErr w:type="spellStart"/>
+      <w:r>
+        <w:rPr>
+          <w:rFonts w:asciiTheme="minorHAnsi" w:hAnsiTheme="minorHAnsi" w:cstheme="minorHAnsi"/>
+        </w:rPr>
+        <w:t>OpenALPR</w:t>
+      </w:r>
+      <w:proofErr w:type="spellEnd"/>
+      <w:r>
+        <w:rPr>
+          <w:rFonts w:asciiTheme="minorHAnsi" w:hAnsiTheme="minorHAnsi" w:cstheme="minorHAnsi"/>
+        </w:rPr>
+        <w:t xml:space="preserve"> и </w:t>
+      </w:r>
+      <w:r>
+        <w:rPr>
+          <w:rFonts w:asciiTheme="minorHAnsi" w:hAnsiTheme="minorHAnsi" w:cstheme="minorHAnsi"/>
+          <w:lang w:val="en-US"/>
+        </w:rPr>
+        <w:t>POLISCAN</w:t>
+      </w:r>
+      <w:r>
+        <w:rPr>
+          <w:rFonts w:asciiTheme="minorHAnsi" w:hAnsiTheme="minorHAnsi" w:cstheme="minorHAnsi"/>
+        </w:rPr>
+        <w:t>. Для исследования использовались критерии: точность, стоимость внедрения и используемые технологии.</w:t>
+      </w:r>
+    </w:p>
+    <w:p>
+      <w:pPr>
+        <w:pStyle w:val="a4"/>
+        <w:rPr>
+          <w:rFonts w:asciiTheme="minorHAnsi" w:hAnsiTheme="minorHAnsi" w:cstheme="minorHAnsi"/>
+        </w:rPr>
+      </w:pPr>
+      <w:r>
+        <w:rPr>
+          <w:rFonts w:asciiTheme="minorHAnsi" w:hAnsiTheme="minorHAnsi" w:cstheme="minorHAnsi"/>
+        </w:rPr>
+        <w:t xml:space="preserve">На основании обзора сформулированы </w:t>
+      </w:r>
+      <w:r>
+        <w:rPr>
+          <w:rFonts w:asciiTheme="minorHAnsi" w:hAnsiTheme="minorHAnsi" w:cstheme="minorHAnsi"/>
+          <w:b/>
+          <w:bCs/>
+        </w:rPr>
+        <w:t>требования к разрабатываем</w:t>
+      </w:r>
+      <w:r>
+        <w:rPr>
+          <w:rFonts w:asciiTheme="minorHAnsi" w:hAnsiTheme="minorHAnsi" w:cstheme="minorHAnsi"/>
+          <w:b/>
+          <w:bCs/>
+        </w:rPr>
+        <w:t>ому приложению</w:t>
+      </w:r>
+      <w:r>
+        <w:rPr>
+          <w:rFonts w:asciiTheme="minorHAnsi" w:hAnsiTheme="minorHAnsi" w:cstheme="minorHAnsi"/>
+        </w:rPr>
+        <w:t xml:space="preserve">: высокая точность, работа в условиях реального времени, возможность </w:t>
+      </w:r>
+      <w:proofErr w:type="spellStart"/>
+      <w:r>
+        <w:rPr>
+          <w:rFonts w:asciiTheme="minorHAnsi" w:hAnsiTheme="minorHAnsi" w:cstheme="minorHAnsi"/>
+        </w:rPr>
+        <w:t>дообучения</w:t>
+      </w:r>
+      <w:proofErr w:type="spellEnd"/>
+      <w:r>
+        <w:rPr>
+          <w:rFonts w:asciiTheme="minorHAnsi" w:hAnsiTheme="minorHAnsi" w:cstheme="minorHAnsi"/>
+        </w:rPr>
+        <w:t xml:space="preserve"> и адаптации под разные условия съёмки.</w:t>
+      </w:r>
+    </w:p>
+    <w:p>
+      <w:pPr>
+        <w:pStyle w:val="a5"/>
+      </w:pPr>
+      <w:r>
+        <w:t>Слайд 6</w:t>
+      </w:r>
+    </w:p>
+    <w:p>
+      <w:pPr>
+        <w:pStyle w:val="a4"/>
+        <w:rPr>
+          <w:rFonts w:asciiTheme="minorHAnsi" w:hAnsiTheme="minorHAnsi" w:cstheme="minorHAnsi"/>
+        </w:rPr>
+      </w:pPr>
+      <w:r>
+        <w:rPr>
+          <w:rFonts w:asciiTheme="minorHAnsi" w:hAnsiTheme="minorHAnsi" w:cstheme="minorHAnsi"/>
+        </w:rPr>
+        <w:t>Здесь</w:t>
+      </w:r>
+      <w:r>
+        <w:rPr>
+          <w:rFonts w:asciiTheme="minorHAnsi" w:hAnsiTheme="minorHAnsi" w:cstheme="minorHAnsi"/>
+        </w:rPr>
+        <w:t xml:space="preserve"> представлены примеры пользовательских интерфейсов рассмотренных решений.</w:t>
+      </w:r>
+    </w:p>
+    <w:p>
+      <w:pPr>
+        <w:pStyle w:val="a5"/>
+      </w:pPr>
+      <w:r>
+        <w:t>Слайд 7</w:t>
+      </w:r>
+    </w:p>
+    <w:p>
+      <w:pPr>
+        <w:pStyle w:val="a4"/>
+        <w:rPr>
+          <w:rFonts w:asciiTheme="minorHAnsi" w:hAnsiTheme="minorHAnsi" w:cstheme="minorHAnsi"/>
+        </w:rPr>
+      </w:pPr>
+      <w:r>
+        <w:rPr>
+          <w:rFonts w:asciiTheme="minorHAnsi" w:hAnsiTheme="minorHAnsi" w:cstheme="minorHAnsi"/>
+        </w:rPr>
+        <w:t>Далее</w:t>
+      </w:r>
+      <w:r>
+        <w:rPr>
+          <w:rFonts w:asciiTheme="minorHAnsi" w:hAnsiTheme="minorHAnsi" w:cstheme="minorHAnsi"/>
+        </w:rPr>
+        <w:t xml:space="preserve"> был проведён </w:t>
+      </w:r>
+      <w:r>
+        <w:rPr>
+          <w:rFonts w:asciiTheme="minorHAnsi" w:hAnsiTheme="minorHAnsi" w:cstheme="minorHAnsi"/>
+          <w:b/>
+          <w:bCs/>
+        </w:rPr>
+        <w:t>обзор и выбор различных инструментов</w:t>
+      </w:r>
+      <w:r>
+        <w:rPr>
+          <w:rFonts w:asciiTheme="minorHAnsi" w:hAnsiTheme="minorHAnsi" w:cstheme="minorHAnsi"/>
+        </w:rPr>
+        <w:t xml:space="preserve">, подходящих для реализации системы. Сравнивались языки программирования, </w:t>
+      </w:r>
+      <w:r>
+        <w:rPr>
+          <w:rFonts w:asciiTheme="minorHAnsi" w:hAnsiTheme="minorHAnsi" w:cstheme="minorHAnsi"/>
+        </w:rPr>
+        <w:t xml:space="preserve">основные </w:t>
+      </w:r>
+      <w:r>
+        <w:rPr>
+          <w:rFonts w:asciiTheme="minorHAnsi" w:hAnsiTheme="minorHAnsi" w:cstheme="minorHAnsi"/>
+        </w:rPr>
+        <w:t>библиотеки для компьютерного зрения, модели для обнаружения объектов и распознавания текста, а также решения для хранения данных. В качестве основного языка был выбран Python как наиболее распространённый в сфере компьютерного зрения. Для детекции объектов выбрано семейство моделей YOLO, так как оно обеспечивает хорошее соотношение скорости и точности</w:t>
+      </w:r>
+      <w:r>
+        <w:rPr>
+          <w:rFonts w:asciiTheme="minorHAnsi" w:hAnsiTheme="minorHAnsi" w:cstheme="minorHAnsi"/>
+        </w:rPr>
+        <w:t xml:space="preserve">, и </w:t>
+      </w:r>
+      <w:r>
+        <w:rPr>
+          <w:rFonts w:asciiTheme="minorHAnsi" w:hAnsiTheme="minorHAnsi" w:cstheme="minorHAnsi"/>
+        </w:rPr>
+        <w:t>позволяет подобрать модель под конкретные требования по производительности</w:t>
+      </w:r>
+      <w:r>
+        <w:rPr>
+          <w:rFonts w:asciiTheme="minorHAnsi" w:hAnsiTheme="minorHAnsi" w:cstheme="minorHAnsi"/>
+        </w:rPr>
+        <w:t xml:space="preserve">. Для распознавания текста изначально использовался </w:t>
+      </w:r>
+      <w:proofErr w:type="spellStart"/>
+      <w:r>
+        <w:rPr>
+          <w:rFonts w:asciiTheme="minorHAnsi" w:hAnsiTheme="minorHAnsi" w:cstheme="minorHAnsi"/>
+        </w:rPr>
+        <w:t>EasyOCR</w:t>
+      </w:r>
+      <w:proofErr w:type="spellEnd"/>
+      <w:r>
+        <w:rPr>
+          <w:rFonts w:asciiTheme="minorHAnsi" w:hAnsiTheme="minorHAnsi" w:cstheme="minorHAnsi"/>
+        </w:rPr>
+        <w:t xml:space="preserve">, но он был заменён на более точный </w:t>
+      </w:r>
+      <w:proofErr w:type="spellStart"/>
+      <w:r>
+        <w:rPr>
+          <w:rFonts w:asciiTheme="minorHAnsi" w:hAnsiTheme="minorHAnsi" w:cstheme="minorHAnsi"/>
+        </w:rPr>
+        <w:t>PaddleOCR</w:t>
+      </w:r>
+      <w:proofErr w:type="spellEnd"/>
+      <w:r>
+        <w:rPr>
+          <w:rFonts w:asciiTheme="minorHAnsi" w:hAnsiTheme="minorHAnsi" w:cstheme="minorHAnsi"/>
+        </w:rPr>
+        <w:t>, т.к. первый вариант давал ошибочные распознавания на тестовом видеоряде.</w:t>
+      </w:r>
+      <w:r>
+        <w:rPr>
+          <w:rFonts w:asciiTheme="minorHAnsi" w:hAnsiTheme="minorHAnsi" w:cstheme="minorHAnsi"/>
+        </w:rPr>
+        <w:t xml:space="preserve"> Хранение данных реализовано с использованием </w:t>
+      </w:r>
+      <w:proofErr w:type="spellStart"/>
+      <w:r>
+        <w:rPr>
+          <w:rFonts w:asciiTheme="minorHAnsi" w:hAnsiTheme="minorHAnsi" w:cstheme="minorHAnsi"/>
+        </w:rPr>
+        <w:t>PostgreSQL</w:t>
+      </w:r>
+      <w:proofErr w:type="spellEnd"/>
+      <w:r>
+        <w:rPr>
+          <w:rFonts w:asciiTheme="minorHAnsi" w:hAnsiTheme="minorHAnsi" w:cstheme="minorHAnsi"/>
+        </w:rPr>
+        <w:t>,</w:t>
+      </w:r>
+      <w:r>
+        <w:rPr>
+          <w:rFonts w:asciiTheme="minorHAnsi" w:hAnsiTheme="minorHAnsi" w:cstheme="minorHAnsi"/>
+        </w:rPr>
+        <w:t xml:space="preserve"> что позволит использовать асинхронные запросы к базе данных для ускорения приложения,</w:t>
+      </w:r>
+      <w:r>
+        <w:rPr>
+          <w:rFonts w:asciiTheme="minorHAnsi" w:hAnsiTheme="minorHAnsi" w:cstheme="minorHAnsi"/>
+        </w:rPr>
+        <w:t xml:space="preserve"> а асинхронн</w:t>
+      </w:r>
+      <w:r>
+        <w:rPr>
+          <w:rFonts w:asciiTheme="minorHAnsi" w:hAnsiTheme="minorHAnsi" w:cstheme="minorHAnsi"/>
+        </w:rPr>
+        <w:t>ое распознавание текста с полученных автомобильных номеров позволит не останавливать основной поток распознавания регистрационных знаков с видеоряда, что также служит для повышения производительности</w:t>
+      </w:r>
+      <w:r>
+        <w:rPr>
+          <w:rFonts w:asciiTheme="minorHAnsi" w:hAnsiTheme="minorHAnsi" w:cstheme="minorHAnsi"/>
+        </w:rPr>
+        <w:t xml:space="preserve">. Это создает основу для реализации </w:t>
+      </w:r>
+      <w:r>
+        <w:rPr>
+          <w:rFonts w:asciiTheme="minorHAnsi" w:hAnsiTheme="minorHAnsi" w:cstheme="minorHAnsi"/>
+        </w:rPr>
+        <w:t>прототипа приложения для практического применения.</w:t>
+      </w:r>
+    </w:p>
+    <w:p>
+      <w:pPr>
+        <w:pStyle w:val="a5"/>
+      </w:pPr>
+      <w:r>
+        <w:t>Слайд 8</w:t>
+      </w:r>
+    </w:p>
+    <w:p>
+      <w:pPr>
+        <w:rPr>
+          <w:rFonts w:cstheme="minorHAnsi"/>
+          <w:sz w:val="24"/>
+          <w:szCs w:val="24"/>
+        </w:rPr>
+      </w:pPr>
+      <w:r>
+        <w:rPr>
+          <w:rFonts w:cstheme="minorHAnsi"/>
+          <w:sz w:val="24"/>
+          <w:szCs w:val="24"/>
+        </w:rPr>
+        <w:t>Следующий этап посвящен</w:t>
+      </w:r>
+      <w:r>
+        <w:rPr>
+          <w:rFonts w:cstheme="minorHAnsi"/>
+          <w:sz w:val="24"/>
+          <w:szCs w:val="24"/>
+        </w:rPr>
+        <w:t xml:space="preserve"> </w:t>
+      </w:r>
+      <w:r>
+        <w:rPr>
+          <w:rFonts w:cstheme="minorHAnsi"/>
+          <w:b/>
+          <w:bCs/>
+          <w:sz w:val="24"/>
+          <w:szCs w:val="24"/>
+        </w:rPr>
         <w:t>реализации прототипа приложения</w:t>
       </w:r>
       <w:r>
@@ -508,7 +1167,71 @@
           <w:sz w:val="24"/>
           <w:szCs w:val="24"/>
         </w:rPr>
-        <w:t>.  Сначала была проведена подготовка датасета. Для обучения модели детекции номерных знаков были использованы открытые датасеты, изначально предназначенные для сегментации. Их структура была вручную переработана под задачу детекции. Для OCR-модели изображения размечались вручную, включая точный текст каждого номера.</w:t>
+        <w:t xml:space="preserve">.  Сначала была проведена подготовка </w:t>
+      </w:r>
+      <w:proofErr w:type="spellStart"/>
+      <w:r>
+        <w:rPr>
+          <w:rFonts w:cstheme="minorHAnsi"/>
+          <w:b/>
+          <w:bCs/>
+          <w:sz w:val="24"/>
+          <w:szCs w:val="24"/>
+        </w:rPr>
+        <w:t>датасета</w:t>
+      </w:r>
+      <w:proofErr w:type="spellEnd"/>
+      <w:r>
+        <w:rPr>
+          <w:rFonts w:cstheme="minorHAnsi"/>
+          <w:sz w:val="24"/>
+          <w:szCs w:val="24"/>
+        </w:rPr>
+        <w:t xml:space="preserve">. Для обучения модели детекции номерных знаков были использованы открытые </w:t>
+      </w:r>
+      <w:proofErr w:type="spellStart"/>
+      <w:r>
+        <w:rPr>
+          <w:rFonts w:cstheme="minorHAnsi"/>
+          <w:sz w:val="24"/>
+          <w:szCs w:val="24"/>
+        </w:rPr>
+        <w:t>датасеты</w:t>
+      </w:r>
+      <w:proofErr w:type="spellEnd"/>
+      <w:r>
+        <w:rPr>
+          <w:rFonts w:cstheme="minorHAnsi"/>
+          <w:sz w:val="24"/>
+          <w:szCs w:val="24"/>
+        </w:rPr>
+        <w:t>, изначально предназначенные для сегментации. Их структура была вручную переработана под задачу детекции. Для OCR-модели изображения размечались вручную, включая точный текст каждого номера</w:t>
+      </w:r>
+      <w:r>
+        <w:rPr>
+          <w:rFonts w:cstheme="minorHAnsi"/>
+          <w:sz w:val="24"/>
+          <w:szCs w:val="24"/>
+        </w:rPr>
+        <w:t xml:space="preserve"> с изображений из собранных </w:t>
+      </w:r>
+      <w:proofErr w:type="spellStart"/>
+      <w:r>
+        <w:rPr>
+          <w:rFonts w:cstheme="minorHAnsi"/>
+          <w:sz w:val="24"/>
+          <w:szCs w:val="24"/>
+        </w:rPr>
+        <w:t>датасетов</w:t>
+      </w:r>
+      <w:proofErr w:type="spellEnd"/>
+      <w:r>
+        <w:rPr>
+          <w:rFonts w:cstheme="minorHAnsi"/>
+          <w:sz w:val="24"/>
+          <w:szCs w:val="24"/>
+        </w:rPr>
+        <w:t>.</w:t>
       </w:r>
       <w:r>
         <w:rPr>
@@ -530,10 +1253,173 @@
       <w:r>
         <w:rPr>
           <w:rFonts w:cstheme="minorHAnsi"/>
-          <w:sz w:val="24"/>
-          <w:szCs w:val="24"/>
-        </w:rPr>
-        <w:t xml:space="preserve">Для детекции номеров использовалось семейство моделей YOLO. В результате практических экспериментов, включавших </w:t>
+          <w:color w:val="FF0000"/>
+          <w:sz w:val="24"/>
+          <w:szCs w:val="24"/>
+          <w:lang w:val="en-US"/>
+        </w:rPr>
+        <w:t>P</w:t>
+      </w:r>
+      <w:r>
+        <w:rPr>
+          <w:rFonts w:cstheme="minorHAnsi"/>
+          <w:color w:val="FF0000"/>
+          <w:sz w:val="24"/>
+          <w:szCs w:val="24"/>
+        </w:rPr>
+        <w:t>.</w:t>
+      </w:r>
+      <w:r>
+        <w:rPr>
+          <w:rFonts w:cstheme="minorHAnsi"/>
+          <w:color w:val="FF0000"/>
+          <w:sz w:val="24"/>
+          <w:szCs w:val="24"/>
+          <w:lang w:val="en-US"/>
+        </w:rPr>
+        <w:t>s</w:t>
+      </w:r>
+      <w:r>
+        <w:rPr>
+          <w:rFonts w:cstheme="minorHAnsi"/>
+          <w:color w:val="FF0000"/>
+          <w:sz w:val="24"/>
+          <w:szCs w:val="24"/>
+        </w:rPr>
+        <w:t xml:space="preserve">. </w:t>
+      </w:r>
+      <w:proofErr w:type="spellStart"/>
+      <w:r>
+        <w:rPr>
+          <w:rFonts w:cstheme="minorHAnsi"/>
+          <w:color w:val="FF0000"/>
+          <w:sz w:val="24"/>
+          <w:szCs w:val="24"/>
+          <w:lang w:val="en-US"/>
+        </w:rPr>
+        <w:t>mAP</w:t>
+      </w:r>
+      <w:proofErr w:type="spellEnd"/>
+      <w:r>
+        <w:rPr>
+          <w:rFonts w:cstheme="minorHAnsi"/>
+          <w:color w:val="FF0000"/>
+          <w:sz w:val="24"/>
+          <w:szCs w:val="24"/>
+        </w:rPr>
+        <w:t xml:space="preserve"> </w:t>
+      </w:r>
+      <w:r>
+        <w:rPr>
+          <w:rFonts w:cstheme="minorHAnsi"/>
+          <w:sz w:val="24"/>
+          <w:szCs w:val="24"/>
+        </w:rPr>
+        <w:t xml:space="preserve">- </w:t>
+      </w:r>
+      <w:r>
+        <w:rPr>
+          <w:rFonts w:cstheme="minorHAnsi"/>
+          <w:sz w:val="24"/>
+          <w:szCs w:val="24"/>
+        </w:rPr>
+        <w:t>это основная метрика качества в задачах детекции объектов. Она показывает, насколько точно и полно модель находит объекты на изображении</w:t>
+      </w:r>
+      <w:r>
+        <w:rPr>
+          <w:rFonts w:cstheme="minorHAnsi"/>
+          <w:sz w:val="24"/>
+          <w:szCs w:val="24"/>
+        </w:rPr>
+        <w:t xml:space="preserve">. </w:t>
+      </w:r>
+      <w:r>
+        <w:rPr>
+          <w:rFonts w:cstheme="minorHAnsi"/>
+          <w:color w:val="FF0000"/>
+          <w:sz w:val="24"/>
+          <w:szCs w:val="24"/>
+        </w:rPr>
+        <w:t>0</w:t>
+      </w:r>
+      <w:r>
+        <w:rPr>
+          <w:rFonts w:cstheme="minorHAnsi"/>
+          <w:color w:val="FF0000"/>
+          <w:sz w:val="24"/>
+          <w:szCs w:val="24"/>
+          <w:lang w:val="en-US"/>
+        </w:rPr>
+        <w:t xml:space="preserve">.95 </w:t>
+      </w:r>
+      <w:r>
+        <w:rPr>
+          <w:rFonts w:cstheme="minorHAnsi"/>
+          <w:sz w:val="24"/>
+          <w:szCs w:val="24"/>
+          <w:lang w:val="en-US"/>
+        </w:rPr>
+        <w:t xml:space="preserve">– </w:t>
+      </w:r>
+      <w:r>
+        <w:rPr>
+          <w:rFonts w:cstheme="minorHAnsi"/>
+          <w:sz w:val="24"/>
+          <w:szCs w:val="24"/>
+        </w:rPr>
+        <w:t>порог, при котором считается правильное обнаружение объекта.</w:t>
+      </w:r>
+      <w:r>
+        <w:rPr>
+          <w:rFonts w:cstheme="minorHAnsi"/>
+          <w:sz w:val="24"/>
+          <w:szCs w:val="24"/>
+        </w:rPr>
+        <w:br w:type="page"/>
+      </w:r>
+    </w:p>
+    <w:p>
+      <w:pPr>
+        <w:pStyle w:val="a5"/>
+      </w:pPr>
+      <w:r>
+        <w:lastRenderedPageBreak/>
+        <w:t>Слайд 9</w:t>
+      </w:r>
+    </w:p>
+    <w:p>
+      <w:pPr>
+        <w:rPr>
+          <w:rFonts w:cstheme="minorHAnsi"/>
+          <w:sz w:val="24"/>
+          <w:szCs w:val="24"/>
+        </w:rPr>
+      </w:pPr>
+      <w:r>
+        <w:rPr>
+          <w:rFonts w:cstheme="minorHAnsi"/>
+          <w:sz w:val="24"/>
+          <w:szCs w:val="24"/>
+        </w:rPr>
+        <w:t xml:space="preserve">Для детекции номеров использовалось </w:t>
+      </w:r>
+      <w:r>
+        <w:rPr>
+          <w:rFonts w:cstheme="minorHAnsi"/>
+          <w:b/>
+          <w:bCs/>
+          <w:sz w:val="24"/>
+          <w:szCs w:val="24"/>
+        </w:rPr>
+        <w:t>семейство моделей YOLO</w:t>
+      </w:r>
+      <w:r>
+        <w:rPr>
+          <w:rFonts w:cstheme="minorHAnsi"/>
+          <w:sz w:val="24"/>
+          <w:szCs w:val="24"/>
+        </w:rPr>
+        <w:t xml:space="preserve">. В результате практических экспериментов, включавших </w:t>
       </w:r>
       <w:r>
         <w:rPr>
@@ -549,7 +1435,23 @@
           <w:sz w:val="24"/>
           <w:szCs w:val="24"/>
         </w:rPr>
-        <w:t xml:space="preserve">, наилучшие результаты показала </w:t>
+        <w:t xml:space="preserve">, наилучшие результаты </w:t>
+      </w:r>
+      <w:r>
+        <w:rPr>
+          <w:rFonts w:cstheme="minorHAnsi"/>
+          <w:sz w:val="24"/>
+          <w:szCs w:val="24"/>
+        </w:rPr>
+        <w:t xml:space="preserve">среди протестированных версий </w:t>
+      </w:r>
+      <w:r>
+        <w:rPr>
+          <w:rFonts w:cstheme="minorHAnsi"/>
+          <w:sz w:val="24"/>
+          <w:szCs w:val="24"/>
+        </w:rPr>
+        <w:t xml:space="preserve">показала </w:t>
       </w:r>
       <w:r>
         <w:rPr>
@@ -589,7 +1491,23 @@
           <w:sz w:val="24"/>
           <w:szCs w:val="24"/>
         </w:rPr>
-        <w:t xml:space="preserve"> версии в конфигурации </w:t>
+        <w:t xml:space="preserve"> версии </w:t>
+      </w:r>
+      <w:r>
+        <w:rPr>
+          <w:rFonts w:cstheme="minorHAnsi"/>
+          <w:sz w:val="24"/>
+          <w:szCs w:val="24"/>
+        </w:rPr>
+        <w:t xml:space="preserve">в </w:t>
+      </w:r>
+      <w:r>
+        <w:rPr>
+          <w:rFonts w:cstheme="minorHAnsi"/>
+          <w:sz w:val="24"/>
+          <w:szCs w:val="24"/>
+        </w:rPr>
+        <w:t xml:space="preserve">конфигурации </w:t>
       </w:r>
       <w:r>
         <w:rPr>
@@ -614,15 +1532,81 @@
           <w:sz w:val="24"/>
           <w:szCs w:val="24"/>
         </w:rPr>
-        <w:t>в качестве предобученных весов.</w:t>
-      </w:r>
-      <w:r>
-        <w:rPr>
-          <w:rFonts w:cstheme="minorHAnsi"/>
-          <w:sz w:val="24"/>
-          <w:szCs w:val="24"/>
-        </w:rPr>
-        <w:t xml:space="preserve"> Основная проблема заключалась в низкой уверенности предсказаний</w:t>
+        <w:t xml:space="preserve">в качестве </w:t>
+      </w:r>
+      <w:proofErr w:type="spellStart"/>
+      <w:r>
+        <w:rPr>
+          <w:rFonts w:cstheme="minorHAnsi"/>
+          <w:sz w:val="24"/>
+          <w:szCs w:val="24"/>
+        </w:rPr>
+        <w:t>предобученных</w:t>
+      </w:r>
+      <w:proofErr w:type="spellEnd"/>
+      <w:r>
+        <w:rPr>
+          <w:rFonts w:cstheme="minorHAnsi"/>
+          <w:sz w:val="24"/>
+          <w:szCs w:val="24"/>
+        </w:rPr>
+        <w:t xml:space="preserve"> весов.</w:t>
+      </w:r>
+      <w:r>
+        <w:rPr>
+          <w:rFonts w:cstheme="minorHAnsi"/>
+          <w:sz w:val="24"/>
+          <w:szCs w:val="24"/>
+        </w:rPr>
+        <w:t xml:space="preserve"> Основная проблема </w:t>
+      </w:r>
+      <w:r>
+        <w:rPr>
+          <w:rFonts w:cstheme="minorHAnsi"/>
+          <w:sz w:val="24"/>
+          <w:szCs w:val="24"/>
+        </w:rPr>
+        <w:t>во</w:t>
+      </w:r>
+      <w:r>
+        <w:rPr>
+          <w:rFonts w:cstheme="minorHAnsi"/>
+          <w:sz w:val="24"/>
+          <w:szCs w:val="24"/>
+        </w:rPr>
+        <w:t xml:space="preserve"> </w:t>
+      </w:r>
+      <w:r>
+        <w:rPr>
+          <w:rFonts w:cstheme="minorHAnsi"/>
+          <w:sz w:val="24"/>
+          <w:szCs w:val="24"/>
+        </w:rPr>
+        <w:t>время</w:t>
+      </w:r>
+      <w:r>
+        <w:rPr>
+          <w:rFonts w:cstheme="minorHAnsi"/>
+          <w:sz w:val="24"/>
+          <w:szCs w:val="24"/>
+        </w:rPr>
+        <w:t xml:space="preserve"> обучения</w:t>
+      </w:r>
+      <w:r>
+        <w:rPr>
+          <w:rFonts w:cstheme="minorHAnsi"/>
+          <w:sz w:val="24"/>
+          <w:szCs w:val="24"/>
+        </w:rPr>
+        <w:t xml:space="preserve"> </w:t>
+      </w:r>
+      <w:r>
+        <w:rPr>
+          <w:rFonts w:cstheme="minorHAnsi"/>
+          <w:sz w:val="24"/>
+          <w:szCs w:val="24"/>
+        </w:rPr>
+        <w:t>заключалась в низкой уверенности предсказаний</w:t>
       </w:r>
       <w:r>
         <w:rPr>
@@ -659,19 +1643,37 @@
     </w:p>
     <w:p>
       <w:pPr>
-        <w:rPr>
-          <w:rFonts w:cstheme="minorHAnsi"/>
-          <w:sz w:val="24"/>
-          <w:szCs w:val="24"/>
-        </w:rPr>
-      </w:pPr>
-      <w:r>
-        <w:rPr>
-          <w:rFonts w:cstheme="minorHAnsi"/>
-          <w:sz w:val="24"/>
-          <w:szCs w:val="24"/>
-        </w:rPr>
-        <w:t xml:space="preserve">Приложение было реализовано с асинхронной </w:t>
+        <w:pStyle w:val="a5"/>
+      </w:pPr>
+      <w:r>
+        <w:t>Слайд 10</w:t>
+      </w:r>
+    </w:p>
+    <w:p>
+      <w:pPr>
+        <w:rPr>
+          <w:rFonts w:cstheme="minorHAnsi"/>
+          <w:sz w:val="24"/>
+          <w:szCs w:val="24"/>
+        </w:rPr>
+      </w:pPr>
+      <w:r>
+        <w:rPr>
+          <w:rFonts w:cstheme="minorHAnsi"/>
+          <w:b/>
+          <w:bCs/>
+          <w:sz w:val="24"/>
+          <w:szCs w:val="24"/>
+        </w:rPr>
+        <w:t>Приложение</w:t>
+      </w:r>
+      <w:r>
+        <w:rPr>
+          <w:rFonts w:cstheme="minorHAnsi"/>
+          <w:sz w:val="24"/>
+          <w:szCs w:val="24"/>
+        </w:rPr>
+        <w:t xml:space="preserve"> было реализовано с асинхронной </w:t>
       </w:r>
       <w:r>
         <w:rPr>
@@ -735,7 +1737,23 @@
           <w:sz w:val="24"/>
           <w:szCs w:val="24"/>
         </w:rPr>
-        <w:t xml:space="preserve"> записывается в базу данных. Для повышения качества введена проверка на повтор</w:t>
+        <w:t xml:space="preserve"> записывается в базу данных. Для </w:t>
+      </w:r>
+      <w:r>
+        <w:rPr>
+          <w:rFonts w:cstheme="minorHAnsi"/>
+          <w:sz w:val="24"/>
+          <w:szCs w:val="24"/>
+        </w:rPr>
+        <w:t>уменьшения количества запросов к БД</w:t>
+      </w:r>
+      <w:r>
+        <w:rPr>
+          <w:rFonts w:cstheme="minorHAnsi"/>
+          <w:sz w:val="24"/>
+          <w:szCs w:val="24"/>
+        </w:rPr>
+        <w:t xml:space="preserve"> введена проверка на повтор</w:t>
       </w:r>
       <w:r>
         <w:rPr>
@@ -756,6 +1774,227 @@
     </w:p>
     <w:p>
       <w:pPr>
+        <w:pStyle w:val="a5"/>
+      </w:pPr>
+      <w:r>
+        <w:t>Слайд 11</w:t>
+      </w:r>
+    </w:p>
+    <w:p>
+      <w:pPr>
+        <w:rPr>
+          <w:rFonts w:cstheme="minorHAnsi"/>
+          <w:sz w:val="24"/>
+          <w:szCs w:val="24"/>
+        </w:rPr>
+      </w:pPr>
+      <w:r>
+        <w:rPr>
+          <w:rFonts w:cstheme="minorHAnsi"/>
+          <w:sz w:val="24"/>
+          <w:szCs w:val="24"/>
+        </w:rPr>
+        <w:t xml:space="preserve">На слайде представлены </w:t>
+      </w:r>
+      <w:r>
+        <w:rPr>
+          <w:rFonts w:cstheme="minorHAnsi"/>
+          <w:b/>
+          <w:bCs/>
+          <w:sz w:val="24"/>
+          <w:szCs w:val="24"/>
+        </w:rPr>
+        <w:t>основные характеристики работы</w:t>
+      </w:r>
+      <w:r>
+        <w:rPr>
+          <w:rFonts w:cstheme="minorHAnsi"/>
+          <w:b/>
+          <w:bCs/>
+          <w:sz w:val="24"/>
+          <w:szCs w:val="24"/>
+        </w:rPr>
+        <w:t>. (МЕТРИКИ)</w:t>
+      </w:r>
+    </w:p>
+    <w:p>
+      <w:pPr>
+        <w:rPr>
+          <w:rFonts w:cstheme="minorHAnsi"/>
+          <w:sz w:val="24"/>
+          <w:szCs w:val="24"/>
+        </w:rPr>
+      </w:pPr>
+      <w:r>
+        <w:rPr>
+          <w:rFonts w:cstheme="minorHAnsi"/>
+          <w:sz w:val="24"/>
+          <w:szCs w:val="24"/>
+        </w:rPr>
+        <w:t xml:space="preserve">Всего проведено 14 </w:t>
+      </w:r>
+      <w:r>
+        <w:rPr>
+          <w:rFonts w:cstheme="minorHAnsi"/>
+          <w:sz w:val="24"/>
+          <w:szCs w:val="24"/>
+        </w:rPr>
+        <w:t>обучений разных версий моделей</w:t>
+      </w:r>
+      <w:r>
+        <w:rPr>
+          <w:rFonts w:cstheme="minorHAnsi"/>
+          <w:sz w:val="24"/>
+          <w:szCs w:val="24"/>
+        </w:rPr>
+        <w:t xml:space="preserve">, суммарно занявших 43 часа </w:t>
+      </w:r>
+      <w:r>
+        <w:rPr>
+          <w:rFonts w:cstheme="minorHAnsi"/>
+          <w:sz w:val="24"/>
+          <w:szCs w:val="24"/>
+        </w:rPr>
+        <w:t xml:space="preserve">реального времени - </w:t>
+      </w:r>
+      <w:r>
+        <w:rPr>
+          <w:rFonts w:cstheme="minorHAnsi"/>
+          <w:sz w:val="24"/>
+          <w:szCs w:val="24"/>
+        </w:rPr>
+        <w:t xml:space="preserve">этот процесс позволил подобрать наиболее </w:t>
+      </w:r>
+      <w:r>
+        <w:rPr>
+          <w:rFonts w:cstheme="minorHAnsi"/>
+          <w:sz w:val="24"/>
+          <w:szCs w:val="24"/>
+        </w:rPr>
+        <w:t>подходящие параметры обучения</w:t>
+      </w:r>
+      <w:r>
+        <w:rPr>
+          <w:rFonts w:cstheme="minorHAnsi"/>
+          <w:sz w:val="24"/>
+          <w:szCs w:val="24"/>
+        </w:rPr>
+        <w:t xml:space="preserve"> модели</w:t>
+      </w:r>
+      <w:r>
+        <w:rPr>
+          <w:rFonts w:cstheme="minorHAnsi"/>
+          <w:sz w:val="24"/>
+          <w:szCs w:val="24"/>
+        </w:rPr>
+        <w:t xml:space="preserve">. </w:t>
+      </w:r>
+    </w:p>
+    <w:p>
+      <w:pPr>
+        <w:rPr>
+          <w:rFonts w:cstheme="minorHAnsi"/>
+          <w:sz w:val="24"/>
+          <w:szCs w:val="24"/>
+        </w:rPr>
+      </w:pPr>
+      <w:proofErr w:type="spellStart"/>
+      <w:r>
+        <w:rPr>
+          <w:rFonts w:cstheme="minorHAnsi"/>
+          <w:sz w:val="24"/>
+          <w:szCs w:val="24"/>
+        </w:rPr>
+        <w:t>Датасет</w:t>
+      </w:r>
+      <w:proofErr w:type="spellEnd"/>
+      <w:r>
+        <w:rPr>
+          <w:rFonts w:cstheme="minorHAnsi"/>
+          <w:sz w:val="24"/>
+          <w:szCs w:val="24"/>
+        </w:rPr>
+        <w:t xml:space="preserve"> размером 2400 изображений, </w:t>
+      </w:r>
+      <w:r>
+        <w:rPr>
+          <w:rFonts w:cstheme="minorHAnsi"/>
+          <w:sz w:val="24"/>
+          <w:szCs w:val="24"/>
+        </w:rPr>
+        <w:t>объединенный</w:t>
+      </w:r>
+      <w:r>
+        <w:rPr>
+          <w:rFonts w:cstheme="minorHAnsi"/>
+          <w:sz w:val="24"/>
+          <w:szCs w:val="24"/>
+        </w:rPr>
+        <w:t xml:space="preserve"> из трех открытых </w:t>
+      </w:r>
+      <w:proofErr w:type="spellStart"/>
+      <w:r>
+        <w:rPr>
+          <w:rFonts w:cstheme="minorHAnsi"/>
+          <w:sz w:val="24"/>
+          <w:szCs w:val="24"/>
+        </w:rPr>
+        <w:t>датасетов</w:t>
+      </w:r>
+      <w:proofErr w:type="spellEnd"/>
+      <w:r>
+        <w:rPr>
+          <w:rFonts w:cstheme="minorHAnsi"/>
+          <w:sz w:val="24"/>
+          <w:szCs w:val="24"/>
+        </w:rPr>
+        <w:t xml:space="preserve"> в единую структуру</w:t>
+      </w:r>
+      <w:r>
+        <w:rPr>
+          <w:rFonts w:cstheme="minorHAnsi"/>
+          <w:sz w:val="24"/>
+          <w:szCs w:val="24"/>
+        </w:rPr>
+        <w:t xml:space="preserve">, а </w:t>
+      </w:r>
+      <w:proofErr w:type="gramStart"/>
+      <w:r>
+        <w:rPr>
+          <w:rFonts w:cstheme="minorHAnsi"/>
+          <w:sz w:val="24"/>
+          <w:szCs w:val="24"/>
+        </w:rPr>
+        <w:t>так же</w:t>
+      </w:r>
+      <w:proofErr w:type="gramEnd"/>
+      <w:r>
+        <w:rPr>
+          <w:rFonts w:cstheme="minorHAnsi"/>
+          <w:sz w:val="24"/>
+          <w:szCs w:val="24"/>
+        </w:rPr>
+        <w:t xml:space="preserve"> текстовые аннотации изображений автомобильных номеров</w:t>
+      </w:r>
+      <w:r>
+        <w:rPr>
+          <w:rFonts w:cstheme="minorHAnsi"/>
+          <w:sz w:val="24"/>
+          <w:szCs w:val="24"/>
+        </w:rPr>
+        <w:t>.</w:t>
+      </w:r>
+    </w:p>
+    <w:p>
+      <w:pPr>
+        <w:pStyle w:val="a5"/>
+      </w:pPr>
+      <w:r>
+        <w:t>Слайд 12</w:t>
+      </w:r>
+    </w:p>
+    <w:p>
+      <w:pPr>
         <w:rPr>
           <w:rFonts w:cstheme="minorHAnsi"/>
           <w:sz w:val="24"/>
@@ -776,6 +2015,14 @@
           <w:sz w:val="24"/>
           <w:szCs w:val="24"/>
         </w:rPr>
+        <w:t>а</w:t>
+      </w:r>
+      <w:r>
+        <w:rPr>
+          <w:rFonts w:cstheme="minorHAnsi"/>
+          <w:sz w:val="24"/>
+          <w:szCs w:val="24"/>
+        </w:rPr>
         <w:t xml:space="preserve"> </w:t>
       </w:r>
       <w:r>
@@ -792,7 +2039,15 @@
           <w:sz w:val="24"/>
           <w:szCs w:val="24"/>
         </w:rPr>
-        <w:t xml:space="preserve"> прототип приложения</w:t>
+        <w:t xml:space="preserve">а модель распознавания автомобильных номеров и реализован </w:t>
+      </w:r>
+      <w:r>
+        <w:rPr>
+          <w:rFonts w:cstheme="minorHAnsi"/>
+          <w:sz w:val="24"/>
+          <w:szCs w:val="24"/>
+        </w:rPr>
+        <w:t>прототип приложения</w:t>
       </w:r>
       <w:r>
         <w:rPr>
@@ -833,7 +2088,39 @@
           <w:sz w:val="24"/>
           <w:szCs w:val="24"/>
         </w:rPr>
-        <w:t xml:space="preserve">Была достигнута главная цель проекта — создание работоспособного прототипа приложения, который обеспечивает детекцию номерных знаков, распознавание текста и сохранение результатов в </w:t>
+        <w:t xml:space="preserve">Была достигнута главная цель проекта — создание </w:t>
+      </w:r>
+      <w:r>
+        <w:rPr>
+          <w:rFonts w:cstheme="minorHAnsi"/>
+          <w:sz w:val="24"/>
+          <w:szCs w:val="24"/>
+        </w:rPr>
+        <w:t>модели распознава</w:t>
+      </w:r>
+      <w:r>
+        <w:rPr>
+          <w:rFonts w:cstheme="minorHAnsi"/>
+          <w:sz w:val="24"/>
+          <w:szCs w:val="24"/>
+        </w:rPr>
+        <w:t>н</w:t>
+      </w:r>
+      <w:r>
+        <w:rPr>
+          <w:rFonts w:cstheme="minorHAnsi"/>
+          <w:sz w:val="24"/>
+          <w:szCs w:val="24"/>
+        </w:rPr>
+        <w:t xml:space="preserve">ия и </w:t>
+      </w:r>
+      <w:r>
+        <w:rPr>
+          <w:rFonts w:cstheme="minorHAnsi"/>
+          <w:sz w:val="24"/>
+          <w:szCs w:val="24"/>
+        </w:rPr>
+        <w:t xml:space="preserve">работоспособного прототипа приложения, который обеспечивает детекцию номерных знаков, распознавание текста и сохранение результатов в </w:t>
       </w:r>
       <w:r>
         <w:rPr>
@@ -896,7 +2183,23 @@
           <w:sz w:val="24"/>
           <w:szCs w:val="24"/>
         </w:rPr>
-        <w:t>технологий и решений, применяемых на практике</w:t>
+        <w:t xml:space="preserve">технологий и </w:t>
+      </w:r>
+      <w:r>
+        <w:rPr>
+          <w:rFonts w:cstheme="minorHAnsi"/>
+          <w:sz w:val="24"/>
+          <w:szCs w:val="24"/>
+        </w:rPr>
+        <w:t>систем</w:t>
+      </w:r>
+      <w:r>
+        <w:rPr>
+          <w:rFonts w:cstheme="minorHAnsi"/>
+          <w:sz w:val="24"/>
+          <w:szCs w:val="24"/>
+        </w:rPr>
+        <w:t>, применяемых на практике</w:t>
       </w:r>
     </w:p>
     <w:p>
@@ -974,23 +2277,6 @@
           <w:szCs w:val="24"/>
         </w:rPr>
         <w:t>добавление алгоритмов предобработки и фильтрации изображения, а также реализацию полноценного приложения с графическим пользовательским интерфейсом</w:t>
-      </w:r>
-    </w:p>
-    <w:p>
-      <w:pPr>
-        <w:rPr>
-          <w:rFonts w:cstheme="minorHAnsi"/>
-          <w:sz w:val="24"/>
-          <w:szCs w:val="24"/>
-        </w:rPr>
-      </w:pPr>
-      <w:r>
-        <w:rPr>
-          <w:rFonts w:cstheme="minorHAnsi"/>
-          <w:sz w:val="24"/>
-          <w:szCs w:val="24"/>
-        </w:rPr>
-        <w:t>Спасибо за внимание.</w:t>
       </w:r>
     </w:p>
     <w:sectPr>
@@ -1755,6 +3041,42 @@
       <w:lang w:eastAsia="ru-RU"/>
     </w:rPr>
   </w:style>
+  <w:style w:type="paragraph" w:styleId="a5">
+    <w:name w:val="Title"/>
+    <w:basedOn w:val="a"/>
+    <w:next w:val="a"/>
+    <w:link w:val="a6"/>
+    <w:uiPriority w:val="10"/>
+    <w:qFormat/>
+    <w:rsid w:val="00DC2815"/>
+    <w:pPr>
+      <w:spacing w:after="0" w:line="240" w:lineRule="auto"/>
+      <w:contextualSpacing/>
+    </w:pPr>
+    <w:rPr>
+      <w:rFonts w:asciiTheme="majorHAnsi" w:eastAsiaTheme="majorEastAsia" w:hAnsiTheme="majorHAnsi" w:cstheme="majorBidi"/>
+      <w:spacing w:val="-10"/>
+      <w:kern w:val="28"/>
+      <w:sz w:val="40"/>
+      <w:szCs w:val="56"/>
+      <w:u w:val="single"/>
+    </w:rPr>
+  </w:style>
+  <w:style w:type="character" w:customStyle="1" w:styleId="a6">
+    <w:name w:val="Заголовок Знак"/>
+    <w:basedOn w:val="a0"/>
+    <w:link w:val="a5"/>
+    <w:uiPriority w:val="10"/>
+    <w:rsid w:val="00DC2815"/>
+    <w:rPr>
+      <w:rFonts w:asciiTheme="majorHAnsi" w:eastAsiaTheme="majorEastAsia" w:hAnsiTheme="majorHAnsi" w:cstheme="majorBidi"/>
+      <w:spacing w:val="-10"/>
+      <w:kern w:val="28"/>
+      <w:sz w:val="40"/>
+      <w:szCs w:val="56"/>
+      <w:u w:val="single"/>
+    </w:rPr>
+  </w:style>
 </w:styles>
 </file>
 

</xml_diff>

<commit_message>
final version that was on thesis defense
</commit_message>
<xml_diff>
--- a/speech.docx
+++ b/speech.docx
@@ -7,18 +7,10 @@
         <w:pStyle w:val="a5"/>
       </w:pPr>
       <w:r>
-        <w:t xml:space="preserve">Слайд </w:t>
-      </w:r>
-      <w:proofErr w:type="gramStart"/>
-      <w:r>
-        <w:t>1</w:t>
-      </w:r>
-      <w:r>
-        <w:t xml:space="preserve">  -</w:t>
-      </w:r>
-      <w:proofErr w:type="gramEnd"/>
-      <w:r>
-        <w:t xml:space="preserve"> ВСТУПЛЕНИЕ</w:t>
+        <w:t>Слайд 1</w:t>
+      </w:r>
+      <w:r>
+        <w:t xml:space="preserve">  - ВСТУПЛЕНИЕ</w:t>
       </w:r>
     </w:p>
     <w:p>
@@ -69,16 +61,11 @@
       <w:r>
         <w:t xml:space="preserve">Слайд </w:t>
       </w:r>
-      <w:proofErr w:type="gramStart"/>
       <w:r>
         <w:t>2</w:t>
       </w:r>
       <w:r>
-        <w:t xml:space="preserve">  -</w:t>
-      </w:r>
-      <w:proofErr w:type="gramEnd"/>
-      <w:r>
-        <w:t xml:space="preserve"> АКТУАЛЬНОСТЬ</w:t>
+        <w:t xml:space="preserve">  - АКТУАЛЬНОСТЬ</w:t>
       </w:r>
     </w:p>
     <w:p>
@@ -265,18 +252,10 @@
         <w:pStyle w:val="a5"/>
       </w:pPr>
       <w:r>
-        <w:t xml:space="preserve">Слайд </w:t>
-      </w:r>
-      <w:proofErr w:type="gramStart"/>
-      <w:r>
-        <w:t>3</w:t>
-      </w:r>
-      <w:r>
-        <w:t xml:space="preserve">  -</w:t>
-      </w:r>
-      <w:proofErr w:type="gramEnd"/>
-      <w:r>
-        <w:t xml:space="preserve"> ЦЕЛЬ И ЗАДАЧИ</w:t>
+        <w:t>Слайд 3</w:t>
+      </w:r>
+      <w:r>
+        <w:t xml:space="preserve">  - ЦЕЛЬ И ЗАДАЧИ</w:t>
       </w:r>
     </w:p>
     <w:p>
@@ -542,18 +521,10 @@
         <w:pStyle w:val="a5"/>
       </w:pPr>
       <w:r>
-        <w:t xml:space="preserve">Слайд </w:t>
-      </w:r>
-      <w:proofErr w:type="gramStart"/>
-      <w:r>
-        <w:t>4</w:t>
-      </w:r>
-      <w:r>
-        <w:t xml:space="preserve">  -</w:t>
-      </w:r>
-      <w:proofErr w:type="gramEnd"/>
-      <w:r>
-        <w:t xml:space="preserve"> АРХИТЕКТУРЫ</w:t>
+        <w:t>Слайд 4</w:t>
+      </w:r>
+      <w:r>
+        <w:t xml:space="preserve">  - АРХИТЕКТУРЫ</w:t>
       </w:r>
     </w:p>
     <w:p>
@@ -992,15 +963,7 @@
       </w:pPr>
       <w:r>
         <w:lastRenderedPageBreak/>
-        <w:t xml:space="preserve">Слайд </w:t>
-      </w:r>
-      <w:proofErr w:type="gramStart"/>
-      <w:r>
-        <w:t>5  -</w:t>
-      </w:r>
-      <w:proofErr w:type="gramEnd"/>
-      <w:r>
-        <w:t xml:space="preserve"> СИСТЕМЫ</w:t>
+        <w:t>Слайд 5  - СИСТЕМЫ</w:t>
       </w:r>
     </w:p>
     <w:p>
@@ -1062,7 +1025,39 @@
           <w:sz w:val="24"/>
           <w:szCs w:val="24"/>
         </w:rPr>
-        <w:t xml:space="preserve">. Для исследования использовались критерии: точность, стоимость внедрения и используемые технологии. </w:t>
+        <w:t xml:space="preserve">. Для исследования использовались </w:t>
+      </w:r>
+      <w:r>
+        <w:rPr>
+          <w:rFonts w:cstheme="minorHAnsi"/>
+          <w:sz w:val="24"/>
+          <w:szCs w:val="24"/>
+        </w:rPr>
+        <w:t xml:space="preserve">такие </w:t>
+      </w:r>
+      <w:r>
+        <w:rPr>
+          <w:rFonts w:cstheme="minorHAnsi"/>
+          <w:sz w:val="24"/>
+          <w:szCs w:val="24"/>
+        </w:rPr>
+        <w:t>критерии</w:t>
+      </w:r>
+      <w:r>
+        <w:rPr>
+          <w:rFonts w:cstheme="minorHAnsi"/>
+          <w:sz w:val="24"/>
+          <w:szCs w:val="24"/>
+        </w:rPr>
+        <w:t xml:space="preserve">, как </w:t>
+      </w:r>
+      <w:r>
+        <w:rPr>
+          <w:rFonts w:cstheme="minorHAnsi"/>
+          <w:sz w:val="24"/>
+          <w:szCs w:val="24"/>
+        </w:rPr>
+        <w:t xml:space="preserve">точность, стоимость внедрения и используемые технологии. </w:t>
       </w:r>
     </w:p>
     <w:p>
@@ -1070,15 +1065,7 @@
         <w:pStyle w:val="a5"/>
       </w:pPr>
       <w:r>
-        <w:t xml:space="preserve">Слайд </w:t>
-      </w:r>
-      <w:proofErr w:type="gramStart"/>
-      <w:r>
-        <w:t>6  -</w:t>
-      </w:r>
-      <w:proofErr w:type="gramEnd"/>
-      <w:r>
-        <w:t xml:space="preserve"> ИНТЕРФЕЙСЫ</w:t>
+        <w:t>Слайд 6  - ИНТЕРФЕЙСЫ</w:t>
       </w:r>
     </w:p>
     <w:p>
@@ -1121,15 +1108,7 @@
         <w:pStyle w:val="a5"/>
       </w:pPr>
       <w:r>
-        <w:t xml:space="preserve">Слайд </w:t>
-      </w:r>
-      <w:proofErr w:type="gramStart"/>
-      <w:r>
-        <w:t>7  -</w:t>
-      </w:r>
-      <w:proofErr w:type="gramEnd"/>
-      <w:r>
-        <w:t xml:space="preserve"> ИНСТРУМЕНТЫ</w:t>
+        <w:t>Слайд 7  - ИНСТРУМЕНТЫ</w:t>
       </w:r>
     </w:p>
     <w:p>
@@ -1352,40 +1331,6 @@
           <w:szCs w:val="24"/>
         </w:rPr>
         <w:br/>
-      </w:r>
-      <w:r>
-        <w:rPr>
-          <w:rFonts w:cstheme="minorHAnsi"/>
-          <w:sz w:val="24"/>
-          <w:szCs w:val="24"/>
-        </w:rPr>
-        <w:t xml:space="preserve">Хранение данных реализовано с использованием </w:t>
-      </w:r>
-      <w:r>
-        <w:rPr>
-          <w:rFonts w:cstheme="minorHAnsi"/>
-          <w:b/>
-          <w:bCs/>
-          <w:sz w:val="24"/>
-          <w:szCs w:val="24"/>
-        </w:rPr>
-        <w:t>PostgreSQL</w:t>
-      </w:r>
-      <w:r>
-        <w:rPr>
-          <w:rFonts w:cstheme="minorHAnsi"/>
-          <w:sz w:val="24"/>
-          <w:szCs w:val="24"/>
-        </w:rPr>
-        <w:t>, что позволит использовать асинхронные запросы к базе данных для ускорения приложения, а асинхронное распознавание текста с полученных автомобильных номеров позволит не останавливать основной поток распознавания регистрационных знаков с видеоряда, что также служит для повышения производительности.</w:t>
-      </w:r>
-      <w:r>
-        <w:rPr>
-          <w:rFonts w:cstheme="minorHAnsi"/>
-          <w:sz w:val="24"/>
-          <w:szCs w:val="24"/>
-        </w:rPr>
-        <w:br/>
         <w:t xml:space="preserve">Для хранения данных использована </w:t>
       </w:r>
       <w:r>
@@ -1452,18 +1397,10 @@
         <w:pStyle w:val="a5"/>
       </w:pPr>
       <w:r>
-        <w:t xml:space="preserve">Слайд </w:t>
-      </w:r>
-      <w:proofErr w:type="gramStart"/>
-      <w:r>
-        <w:t>8</w:t>
-      </w:r>
-      <w:r>
-        <w:t xml:space="preserve">  -</w:t>
-      </w:r>
-      <w:proofErr w:type="gramEnd"/>
-      <w:r>
-        <w:t xml:space="preserve"> ДАТАСЕТЫ</w:t>
+        <w:t>Слайд 8</w:t>
+      </w:r>
+      <w:r>
+        <w:t xml:space="preserve">  - ДАТАСЕТЫ</w:t>
       </w:r>
     </w:p>
     <w:p>
@@ -1556,7 +1493,55 @@
           <w:sz w:val="24"/>
           <w:szCs w:val="24"/>
         </w:rPr>
-        <w:t>, изначально предназначенные для сегментации. Их структура была</w:t>
+        <w:t xml:space="preserve">, </w:t>
+      </w:r>
+      <w:r>
+        <w:rPr>
+          <w:rFonts w:cstheme="minorHAnsi"/>
+          <w:sz w:val="24"/>
+          <w:szCs w:val="24"/>
+        </w:rPr>
+        <w:t xml:space="preserve">которые </w:t>
+      </w:r>
+      <w:r>
+        <w:rPr>
+          <w:rFonts w:cstheme="minorHAnsi"/>
+          <w:sz w:val="24"/>
+          <w:szCs w:val="24"/>
+        </w:rPr>
+        <w:t>изначально предназнач</w:t>
+      </w:r>
+      <w:r>
+        <w:rPr>
+          <w:rFonts w:cstheme="minorHAnsi"/>
+          <w:sz w:val="24"/>
+          <w:szCs w:val="24"/>
+        </w:rPr>
+        <w:t xml:space="preserve">ались </w:t>
+      </w:r>
+      <w:r>
+        <w:rPr>
+          <w:rFonts w:cstheme="minorHAnsi"/>
+          <w:sz w:val="24"/>
+          <w:szCs w:val="24"/>
+        </w:rPr>
+        <w:t>для сегментации</w:t>
+      </w:r>
+      <w:r>
+        <w:rPr>
+          <w:rFonts w:cstheme="minorHAnsi"/>
+          <w:sz w:val="24"/>
+          <w:szCs w:val="24"/>
+        </w:rPr>
+        <w:t xml:space="preserve"> объектов</w:t>
+      </w:r>
+      <w:r>
+        <w:rPr>
+          <w:rFonts w:cstheme="minorHAnsi"/>
+          <w:sz w:val="24"/>
+          <w:szCs w:val="24"/>
+        </w:rPr>
+        <w:t>. Их структура была</w:t>
       </w:r>
       <w:r>
         <w:rPr>
@@ -1612,18 +1597,10 @@
         <w:pStyle w:val="a5"/>
       </w:pPr>
       <w:r>
-        <w:t xml:space="preserve">Слайд </w:t>
-      </w:r>
-      <w:proofErr w:type="gramStart"/>
-      <w:r>
-        <w:t>9</w:t>
-      </w:r>
-      <w:r>
-        <w:t xml:space="preserve">  -</w:t>
-      </w:r>
-      <w:proofErr w:type="gramEnd"/>
-      <w:r>
-        <w:t xml:space="preserve"> МОДЕЛЬ ДЕТЕКЦИИ</w:t>
+        <w:t>Слайд 9</w:t>
+      </w:r>
+      <w:r>
+        <w:t xml:space="preserve">  - МОДЕЛЬ ДЕТЕКЦИИ</w:t>
       </w:r>
     </w:p>
     <w:p>
@@ -1640,6 +1617,23 @@
           <w:sz w:val="24"/>
           <w:szCs w:val="24"/>
         </w:rPr>
+        <w:br w:type="page"/>
+      </w:r>
+    </w:p>
+    <w:p>
+      <w:pPr>
+        <w:rPr>
+          <w:rFonts w:cstheme="minorHAnsi"/>
+          <w:sz w:val="24"/>
+          <w:szCs w:val="24"/>
+        </w:rPr>
+      </w:pPr>
+      <w:r>
+        <w:rPr>
+          <w:rFonts w:cstheme="minorHAnsi"/>
+          <w:sz w:val="24"/>
+          <w:szCs w:val="24"/>
+        </w:rPr>
         <w:lastRenderedPageBreak/>
         <w:t xml:space="preserve">Для детекции номерных знаков использовалось </w:t>
       </w:r>
@@ -1968,23 +1962,13 @@
         </w:rPr>
         <w:t xml:space="preserve"> </w:t>
       </w:r>
-      <w:proofErr w:type="gramStart"/>
-      <w:r>
-        <w:rPr>
-          <w:rFonts w:cstheme="minorHAnsi"/>
-          <w:sz w:val="24"/>
-          <w:szCs w:val="24"/>
-        </w:rPr>
-        <w:t>- это</w:t>
-      </w:r>
-      <w:proofErr w:type="gramEnd"/>
-      <w:r>
-        <w:rPr>
-          <w:rFonts w:cstheme="minorHAnsi"/>
-          <w:sz w:val="24"/>
-          <w:szCs w:val="24"/>
-        </w:rPr>
-        <w:t xml:space="preserve"> основная метрика качества в задачах детекции объектов. Она показывает, насколько точно и полно модель находит объекты на изображении</w:t>
+      <w:r>
+        <w:rPr>
+          <w:rFonts w:cstheme="minorHAnsi"/>
+          <w:sz w:val="24"/>
+          <w:szCs w:val="24"/>
+        </w:rPr>
+        <w:t>- это основная метрика качества в задачах детекции объектов. Она показывает, насколько точно и полно модель находит объекты на изображении</w:t>
       </w:r>
       <w:r>
         <w:rPr>
@@ -2034,18 +2018,10 @@
         <w:pStyle w:val="a5"/>
       </w:pPr>
       <w:r>
-        <w:t xml:space="preserve">Слайд </w:t>
-      </w:r>
-      <w:proofErr w:type="gramStart"/>
-      <w:r>
-        <w:t>10</w:t>
-      </w:r>
-      <w:r>
-        <w:t xml:space="preserve">  -</w:t>
-      </w:r>
-      <w:proofErr w:type="gramEnd"/>
-      <w:r>
-        <w:t xml:space="preserve"> ПРИЛОЖЕНИЕ</w:t>
+        <w:t>Слайд 10</w:t>
+      </w:r>
+      <w:r>
+        <w:t xml:space="preserve">  - ПРИЛОЖЕНИЕ</w:t>
       </w:r>
     </w:p>
     <w:p>
@@ -2197,18 +2173,10 @@
         <w:pStyle w:val="a5"/>
       </w:pPr>
       <w:r>
-        <w:t xml:space="preserve">Слайд </w:t>
-      </w:r>
-      <w:proofErr w:type="gramStart"/>
-      <w:r>
-        <w:t>11</w:t>
-      </w:r>
-      <w:r>
-        <w:t xml:space="preserve">  -</w:t>
-      </w:r>
-      <w:proofErr w:type="gramEnd"/>
-      <w:r>
-        <w:t xml:space="preserve"> МЕТРИКИ</w:t>
+        <w:t>Слайд 11</w:t>
+      </w:r>
+      <w:r>
+        <w:t xml:space="preserve">  - МЕТРИКИ</w:t>
       </w:r>
     </w:p>
     <w:p>
@@ -2260,6 +2228,16 @@
       <w:r>
         <w:rPr>
           <w:rFonts w:cstheme="minorHAnsi"/>
+          <w:b/>
+          <w:bCs/>
+          <w:sz w:val="24"/>
+          <w:szCs w:val="24"/>
+        </w:rPr>
+        <w:t xml:space="preserve"> Можно выделить следующее:</w:t>
+      </w:r>
+      <w:r>
+        <w:rPr>
+          <w:rFonts w:cstheme="minorHAnsi"/>
           <w:sz w:val="24"/>
           <w:szCs w:val="24"/>
         </w:rPr>
@@ -2271,7 +2249,15 @@
           <w:sz w:val="24"/>
           <w:szCs w:val="24"/>
         </w:rPr>
-        <w:t xml:space="preserve">Всего проведено 14 </w:t>
+        <w:t xml:space="preserve">- </w:t>
+      </w:r>
+      <w:r>
+        <w:rPr>
+          <w:rFonts w:cstheme="minorHAnsi"/>
+          <w:sz w:val="24"/>
+          <w:szCs w:val="24"/>
+        </w:rPr>
+        <w:t xml:space="preserve">14 </w:t>
       </w:r>
       <w:r>
         <w:rPr>
@@ -2303,31 +2289,7 @@
           <w:sz w:val="24"/>
           <w:szCs w:val="24"/>
         </w:rPr>
-        <w:t xml:space="preserve">, это </w:t>
-      </w:r>
-      <w:r>
-        <w:rPr>
-          <w:rFonts w:cstheme="minorHAnsi"/>
-          <w:sz w:val="24"/>
-          <w:szCs w:val="24"/>
-        </w:rPr>
-        <w:t xml:space="preserve">позволил подобрать наиболее </w:t>
-      </w:r>
-      <w:r>
-        <w:rPr>
-          <w:rFonts w:cstheme="minorHAnsi"/>
-          <w:sz w:val="24"/>
-          <w:szCs w:val="24"/>
-        </w:rPr>
-        <w:t>подходящие параметры обучения</w:t>
-      </w:r>
-      <w:r>
-        <w:rPr>
-          <w:rFonts w:cstheme="minorHAnsi"/>
-          <w:sz w:val="24"/>
-          <w:szCs w:val="24"/>
-        </w:rPr>
-        <w:t xml:space="preserve"> модели.</w:t>
+        <w:t xml:space="preserve"> </w:t>
       </w:r>
       <w:r>
         <w:rPr>
@@ -2391,23 +2353,23 @@
           <w:sz w:val="24"/>
           <w:szCs w:val="24"/>
         </w:rPr>
-        <w:t>, а так</w:t>
-      </w:r>
-      <w:r>
-        <w:rPr>
-          <w:rFonts w:cstheme="minorHAnsi"/>
-          <w:sz w:val="24"/>
-          <w:szCs w:val="24"/>
-        </w:rPr>
-        <w:t xml:space="preserve"> </w:t>
-      </w:r>
-      <w:r>
-        <w:rPr>
-          <w:rFonts w:cstheme="minorHAnsi"/>
-          <w:sz w:val="24"/>
-          <w:szCs w:val="24"/>
-        </w:rPr>
-        <w:t>же текстовые аннотации изображений автомобильных номеров</w:t>
+        <w:t xml:space="preserve">, </w:t>
+      </w:r>
+      <w:r>
+        <w:rPr>
+          <w:rFonts w:cstheme="minorHAnsi"/>
+          <w:sz w:val="24"/>
+          <w:szCs w:val="24"/>
+        </w:rPr>
+        <w:t>и</w:t>
+      </w:r>
+      <w:r>
+        <w:rPr>
+          <w:rFonts w:cstheme="minorHAnsi"/>
+          <w:sz w:val="24"/>
+          <w:szCs w:val="24"/>
+        </w:rPr>
+        <w:t xml:space="preserve"> текстовые аннотации изображений автомобильных номеров</w:t>
       </w:r>
       <w:r>
         <w:rPr>
@@ -2423,18 +2385,10 @@
         <w:pStyle w:val="a5"/>
       </w:pPr>
       <w:r>
-        <w:t xml:space="preserve">Слайд </w:t>
-      </w:r>
-      <w:proofErr w:type="gramStart"/>
-      <w:r>
-        <w:t>12</w:t>
-      </w:r>
-      <w:r>
-        <w:t xml:space="preserve">  -</w:t>
-      </w:r>
-      <w:proofErr w:type="gramEnd"/>
-      <w:r>
-        <w:t xml:space="preserve"> ЗАКЛЮЧЕНИЕ</w:t>
+        <w:t>Слайд 12</w:t>
+      </w:r>
+      <w:r>
+        <w:t xml:space="preserve">  - ЗАКЛЮЧЕНИЕ</w:t>
       </w:r>
     </w:p>
     <w:p>
@@ -2475,15 +2429,47 @@
           <w:sz w:val="24"/>
           <w:szCs w:val="24"/>
         </w:rPr>
-        <w:t>разработан</w:t>
-      </w:r>
-      <w:r>
-        <w:rPr>
-          <w:rFonts w:cstheme="minorHAnsi"/>
-          <w:sz w:val="24"/>
-          <w:szCs w:val="24"/>
-        </w:rPr>
-        <w:t xml:space="preserve">а модель распознавания автомобильных номеров и реализован </w:t>
+        <w:t>достигнута главная цель проекта - создание</w:t>
+      </w:r>
+      <w:r>
+        <w:rPr>
+          <w:rFonts w:cstheme="minorHAnsi"/>
+          <w:sz w:val="24"/>
+          <w:szCs w:val="24"/>
+        </w:rPr>
+        <w:t xml:space="preserve"> модел</w:t>
+      </w:r>
+      <w:r>
+        <w:rPr>
+          <w:rFonts w:cstheme="minorHAnsi"/>
+          <w:sz w:val="24"/>
+          <w:szCs w:val="24"/>
+        </w:rPr>
+        <w:t>и</w:t>
+      </w:r>
+      <w:r>
+        <w:rPr>
+          <w:rFonts w:cstheme="minorHAnsi"/>
+          <w:sz w:val="24"/>
+          <w:szCs w:val="24"/>
+        </w:rPr>
+        <w:t xml:space="preserve"> распознавания автомобильных номеров и </w:t>
+      </w:r>
+      <w:r>
+        <w:rPr>
+          <w:rFonts w:cstheme="minorHAnsi"/>
+          <w:sz w:val="24"/>
+          <w:szCs w:val="24"/>
+        </w:rPr>
+        <w:t>реализация</w:t>
+      </w:r>
+      <w:r>
+        <w:rPr>
+          <w:rFonts w:cstheme="minorHAnsi"/>
+          <w:sz w:val="24"/>
+          <w:szCs w:val="24"/>
+        </w:rPr>
+        <w:t xml:space="preserve"> </w:t>
       </w:r>
       <w:r>
         <w:rPr>
@@ -2499,23 +2485,56 @@
           <w:sz w:val="24"/>
           <w:szCs w:val="24"/>
         </w:rPr>
-        <w:t>, способн</w:t>
-      </w:r>
-      <w:r>
-        <w:rPr>
-          <w:rFonts w:cstheme="minorHAnsi"/>
-          <w:sz w:val="24"/>
-          <w:szCs w:val="24"/>
-        </w:rPr>
-        <w:t>ый</w:t>
-      </w:r>
-      <w:r>
-        <w:rPr>
-          <w:rFonts w:cstheme="minorHAnsi"/>
-          <w:sz w:val="24"/>
-          <w:szCs w:val="24"/>
-        </w:rPr>
-        <w:t xml:space="preserve"> автоматически распознавать регистрационные знаки транспортных средств с видеопотока.</w:t>
+        <w:t xml:space="preserve">, </w:t>
+      </w:r>
+      <w:r>
+        <w:rPr>
+          <w:rFonts w:cstheme="minorHAnsi"/>
+          <w:sz w:val="24"/>
+          <w:szCs w:val="24"/>
+        </w:rPr>
+        <w:t xml:space="preserve">который обеспечивает детекцию номерных знаков, распознавание текста и сохранение результатов в </w:t>
+      </w:r>
+      <w:r>
+        <w:rPr>
+          <w:rFonts w:cstheme="minorHAnsi"/>
+          <w:sz w:val="24"/>
+          <w:szCs w:val="24"/>
+        </w:rPr>
+        <w:t>хранилище</w:t>
+      </w:r>
+      <w:r>
+        <w:rPr>
+          <w:rFonts w:cstheme="minorHAnsi"/>
+          <w:sz w:val="24"/>
+          <w:szCs w:val="24"/>
+        </w:rPr>
+        <w:t xml:space="preserve"> данных</w:t>
+      </w:r>
+      <w:r>
+        <w:rPr>
+          <w:rFonts w:cstheme="minorHAnsi"/>
+          <w:sz w:val="24"/>
+          <w:szCs w:val="24"/>
+        </w:rPr>
+        <w:t>.</w:t>
+      </w:r>
+    </w:p>
+    <w:p>
+      <w:pPr>
+        <w:rPr>
+          <w:rFonts w:cstheme="minorHAnsi"/>
+          <w:sz w:val="24"/>
+          <w:szCs w:val="24"/>
+        </w:rPr>
+      </w:pPr>
+      <w:r>
+        <w:rPr>
+          <w:rFonts w:cstheme="minorHAnsi"/>
+          <w:sz w:val="24"/>
+          <w:szCs w:val="24"/>
+        </w:rPr>
+        <w:t xml:space="preserve"> </w:t>
       </w:r>
       <w:r>
         <w:rPr>
@@ -2531,78 +2550,6 @@
           <w:sz w:val="24"/>
           <w:szCs w:val="24"/>
         </w:rPr>
-        <w:t xml:space="preserve">Была достигнута главная цель проекта — создание </w:t>
-      </w:r>
-      <w:r>
-        <w:rPr>
-          <w:rFonts w:cstheme="minorHAnsi"/>
-          <w:sz w:val="24"/>
-          <w:szCs w:val="24"/>
-        </w:rPr>
-        <w:t>модели распознава</w:t>
-      </w:r>
-      <w:r>
-        <w:rPr>
-          <w:rFonts w:cstheme="minorHAnsi"/>
-          <w:sz w:val="24"/>
-          <w:szCs w:val="24"/>
-        </w:rPr>
-        <w:t>н</w:t>
-      </w:r>
-      <w:r>
-        <w:rPr>
-          <w:rFonts w:cstheme="minorHAnsi"/>
-          <w:sz w:val="24"/>
-          <w:szCs w:val="24"/>
-        </w:rPr>
-        <w:t xml:space="preserve">ия и </w:t>
-      </w:r>
-      <w:r>
-        <w:rPr>
-          <w:rFonts w:cstheme="minorHAnsi"/>
-          <w:sz w:val="24"/>
-          <w:szCs w:val="24"/>
-        </w:rPr>
-        <w:t xml:space="preserve">реализация </w:t>
-      </w:r>
-      <w:r>
-        <w:rPr>
-          <w:rFonts w:cstheme="minorHAnsi"/>
-          <w:sz w:val="24"/>
-          <w:szCs w:val="24"/>
-        </w:rPr>
-        <w:t xml:space="preserve">работоспособного прототипа приложения, который обеспечивает детекцию номерных знаков, распознавание текста и сохранение результатов в </w:t>
-      </w:r>
-      <w:r>
-        <w:rPr>
-          <w:rFonts w:cstheme="minorHAnsi"/>
-          <w:sz w:val="24"/>
-          <w:szCs w:val="24"/>
-        </w:rPr>
-        <w:t>хранилище</w:t>
-      </w:r>
-      <w:r>
-        <w:rPr>
-          <w:rFonts w:cstheme="minorHAnsi"/>
-          <w:sz w:val="24"/>
-          <w:szCs w:val="24"/>
-        </w:rPr>
-        <w:t xml:space="preserve"> данных.</w:t>
-      </w:r>
-      <w:r>
-        <w:rPr>
-          <w:rFonts w:cstheme="minorHAnsi"/>
-          <w:sz w:val="24"/>
-          <w:szCs w:val="24"/>
-        </w:rPr>
-        <w:br/>
-      </w:r>
-      <w:r>
-        <w:rPr>
-          <w:rFonts w:cstheme="minorHAnsi"/>
-          <w:sz w:val="24"/>
-          <w:szCs w:val="24"/>
-        </w:rPr>
         <w:t xml:space="preserve">По </w:t>
       </w:r>
       <w:r>
@@ -2619,7 +2566,23 @@
           <w:sz w:val="24"/>
           <w:szCs w:val="24"/>
         </w:rPr>
-        <w:t xml:space="preserve"> работы:</w:t>
+        <w:t xml:space="preserve"> работы</w:t>
+      </w:r>
+      <w:r>
+        <w:rPr>
+          <w:rFonts w:cstheme="minorHAnsi"/>
+          <w:sz w:val="24"/>
+          <w:szCs w:val="24"/>
+        </w:rPr>
+        <w:t xml:space="preserve"> были выполнены следующие задачи</w:t>
+      </w:r>
+      <w:r>
+        <w:rPr>
+          <w:rFonts w:cstheme="minorHAnsi"/>
+          <w:sz w:val="24"/>
+          <w:szCs w:val="24"/>
+        </w:rPr>
+        <w:t>:</w:t>
       </w:r>
     </w:p>
     <w:p>
@@ -2729,14 +2692,6 @@
         </w:rPr>
         <w:t xml:space="preserve"> приложения</w:t>
       </w:r>
-      <w:r>
-        <w:rPr>
-          <w:rFonts w:cstheme="minorHAnsi"/>
-          <w:sz w:val="24"/>
-          <w:szCs w:val="24"/>
-        </w:rPr>
-        <w:t>, основанный на технических и практических критериях</w:t>
-      </w:r>
     </w:p>
     <w:p>
       <w:pPr>
@@ -2757,7 +2712,15 @@
           <w:sz w:val="24"/>
           <w:szCs w:val="24"/>
         </w:rPr>
-        <w:t xml:space="preserve">Реализован прототип </w:t>
+        <w:t xml:space="preserve">Разработана модель, на основе которой реализован </w:t>
+      </w:r>
+      <w:r>
+        <w:rPr>
+          <w:rFonts w:cstheme="minorHAnsi"/>
+          <w:sz w:val="24"/>
+          <w:szCs w:val="24"/>
+        </w:rPr>
+        <w:t xml:space="preserve">прототип </w:t>
       </w:r>
       <w:r>
         <w:rPr>

</xml_diff>